<commit_message>
docs: add upgrade handling section to release guide (Section 3)
</commit_message>
<xml_diff>
--- a/Securiti_Desktop_Release_Guide.docx
+++ b/Securiti_Desktop_Release_Guide.docx
@@ -2495,7 +2495,1799 @@
                 <w:color w:val="FFFFFF"/>
                 <w:sz w:val="22"/>
               </w:rPr>
-              <w:t>3  RELEASE CHECKLIST  (PRINT AND TICK OFF EACH TIME)</w:t>
+              <w:t>3  HOW UPGRADES WORK — WHAT THE INSTALLER DOES ON AN EXISTING MACHINE</w:t>
+            </w:r>
+          </w:p>
+        </w:tc>
+      </w:tr>
+    </w:tbl>
+    <w:p/>
+    <w:p>
+      <w:pPr>
+        <w:spacing w:before="0" w:after="80"/>
+      </w:pPr>
+      <w:r>
+        <w:rPr>
+          <w:rFonts w:ascii="Calibri" w:hAnsi="Calibri"/>
+          <w:color w:val="1F1F1F"/>
+          <w:sz w:val="20"/>
+        </w:rPr>
+        <w:t>When a customer runs a newer installer on a machine that already has Securiti Desktop installed, Inno Setup detects the existing installation and runs in upgrade mode. The behaviour is different from a fresh install in every way that matters.</w:t>
+      </w:r>
+    </w:p>
+    <w:tbl>
+      <w:tblPr>
+        <w:tblStyle w:val="TableGrid"/>
+        <w:tblW w:type="auto" w:w="0"/>
+        <w:tblLook w:firstColumn="1" w:firstRow="1" w:lastColumn="0" w:lastRow="0" w:noHBand="0" w:noVBand="1" w:val="04A0"/>
+      </w:tblPr>
+      <w:tblGrid>
+        <w:gridCol w:w="9406"/>
+      </w:tblGrid>
+      <w:tr>
+        <w:tc>
+          <w:tcPr>
+            <w:tcW w:type="dxa" w:w="9406"/>
+            <w:shd w:val="clear" w:color="auto" w:fill="E8E8F5"/>
+            <w:tcBorders>
+              <w:top w:val="single" w:sz="4" w:space="0" w:color="060061"/>
+              <w:left w:val="single" w:sz="4" w:space="0" w:color="060061"/>
+              <w:bottom w:val="single" w:sz="4" w:space="0" w:color="060061"/>
+              <w:right w:val="single" w:sz="4" w:space="0" w:color="060061"/>
+            </w:tcBorders>
+          </w:tcPr>
+          <w:p>
+            <w:pPr>
+              <w:spacing w:before="60" w:after="60"/>
+            </w:pPr>
+            <w:r>
+              <w:rPr>
+                <w:rFonts w:ascii="Calibri" w:hAnsi="Calibri"/>
+                <w:sz w:val="19"/>
+              </w:rPr>
+              <w:t>No data is lost during an upgrade. The database, cameras, faces, identities, notifications, stream tokens, and all user accounts survive intact.</w:t>
+            </w:r>
+          </w:p>
+        </w:tc>
+      </w:tr>
+    </w:tbl>
+    <w:p/>
+    <w:p>
+      <w:pPr>
+        <w:spacing w:before="120" w:after="40"/>
+      </w:pPr>
+      <w:r>
+        <w:rPr>
+          <w:rFonts w:ascii="Calibri" w:hAnsi="Calibri"/>
+          <w:b/>
+          <w:color w:val="060061"/>
+          <w:sz w:val="26"/>
+        </w:rPr>
+        <w:t>What the installer does, step by step (upgrade mode)</w:t>
+      </w:r>
+    </w:p>
+    <w:tbl>
+      <w:tblPr>
+        <w:tblStyle w:val="TableGrid"/>
+        <w:tblW w:type="auto" w:w="0"/>
+        <w:tblLook w:firstColumn="1" w:firstRow="1" w:lastColumn="0" w:lastRow="0" w:noHBand="0" w:noVBand="1" w:val="04A0"/>
+      </w:tblPr>
+      <w:tblGrid>
+        <w:gridCol w:w="4703"/>
+        <w:gridCol w:w="4703"/>
+      </w:tblGrid>
+      <w:tr>
+        <w:tc>
+          <w:tcPr>
+            <w:tcW w:type="dxa" w:w="4703"/>
+            <w:shd w:val="clear" w:color="auto" w:fill="060061"/>
+            <w:tcBorders>
+              <w:top w:val="single" w:sz="4" w:space="0" w:color="060061"/>
+              <w:left w:val="single" w:sz="4" w:space="0" w:color="060061"/>
+              <w:bottom w:val="single" w:sz="4" w:space="0" w:color="060061"/>
+              <w:right w:val="single" w:sz="4" w:space="0" w:color="060061"/>
+            </w:tcBorders>
+          </w:tcPr>
+          <w:p>
+            <w:r>
+              <w:rPr>
+                <w:rFonts w:ascii="Calibri" w:hAnsi="Calibri"/>
+                <w:b/>
+                <w:color w:val="FFFFFF"/>
+                <w:sz w:val="19"/>
+              </w:rPr>
+              <w:t>Phase</w:t>
+            </w:r>
+          </w:p>
+        </w:tc>
+        <w:tc>
+          <w:tcPr>
+            <w:tcW w:type="dxa" w:w="4703"/>
+            <w:shd w:val="clear" w:color="auto" w:fill="060061"/>
+            <w:tcBorders>
+              <w:top w:val="single" w:sz="4" w:space="0" w:color="060061"/>
+              <w:left w:val="single" w:sz="4" w:space="0" w:color="060061"/>
+              <w:bottom w:val="single" w:sz="4" w:space="0" w:color="060061"/>
+              <w:right w:val="single" w:sz="4" w:space="0" w:color="060061"/>
+            </w:tcBorders>
+          </w:tcPr>
+          <w:p>
+            <w:r>
+              <w:rPr>
+                <w:rFonts w:ascii="Calibri" w:hAnsi="Calibri"/>
+                <w:b/>
+                <w:color w:val="FFFFFF"/>
+                <w:sz w:val="19"/>
+              </w:rPr>
+              <w:t>What happens</w:t>
+            </w:r>
+          </w:p>
+        </w:tc>
+      </w:tr>
+      <w:tr>
+        <w:tc>
+          <w:tcPr>
+            <w:tcW w:type="dxa" w:w="4703"/>
+            <w:shd w:val="clear" w:color="auto" w:fill="E8E8F5"/>
+            <w:tcBorders>
+              <w:top w:val="single" w:sz="4" w:space="0" w:color="BFBFBF"/>
+              <w:left w:val="single" w:sz="4" w:space="0" w:color="BFBFBF"/>
+              <w:bottom w:val="single" w:sz="4" w:space="0" w:color="BFBFBF"/>
+              <w:right w:val="single" w:sz="4" w:space="0" w:color="BFBFBF"/>
+            </w:tcBorders>
+          </w:tcPr>
+          <w:p>
+            <w:r>
+              <w:rPr>
+                <w:rFonts w:ascii="Calibri" w:hAnsi="Calibri"/>
+                <w:b/>
+                <w:sz w:val="19"/>
+              </w:rPr>
+              <w:t>1. Detect existing install</w:t>
+            </w:r>
+          </w:p>
+        </w:tc>
+        <w:tc>
+          <w:tcPr>
+            <w:tcW w:type="dxa" w:w="4703"/>
+            <w:shd w:val="clear" w:color="auto" w:fill="FFFFFF"/>
+            <w:tcBorders>
+              <w:top w:val="single" w:sz="4" w:space="0" w:color="BFBFBF"/>
+              <w:left w:val="single" w:sz="4" w:space="0" w:color="BFBFBF"/>
+              <w:bottom w:val="single" w:sz="4" w:space="0" w:color="BFBFBF"/>
+              <w:right w:val="single" w:sz="4" w:space="0" w:color="BFBFBF"/>
+            </w:tcBorders>
+          </w:tcPr>
+          <w:p>
+            <w:r>
+              <w:rPr>
+                <w:rFonts w:ascii="Calibri" w:hAnsi="Calibri"/>
+                <w:sz w:val="19"/>
+              </w:rPr>
+              <w:t>Inno Setup checks the Windows registry for the app's uninstall key (keyed to the AppId GUID). If present → upgrade mode. If absent → fresh install.</w:t>
+            </w:r>
+          </w:p>
+        </w:tc>
+      </w:tr>
+      <w:tr>
+        <w:tc>
+          <w:tcPr>
+            <w:tcW w:type="dxa" w:w="4703"/>
+            <w:shd w:val="clear" w:color="auto" w:fill="E8E8F5"/>
+            <w:tcBorders>
+              <w:top w:val="single" w:sz="4" w:space="0" w:color="BFBFBF"/>
+              <w:left w:val="single" w:sz="4" w:space="0" w:color="BFBFBF"/>
+              <w:bottom w:val="single" w:sz="4" w:space="0" w:color="BFBFBF"/>
+              <w:right w:val="single" w:sz="4" w:space="0" w:color="BFBFBF"/>
+            </w:tcBorders>
+          </w:tcPr>
+          <w:p>
+            <w:r>
+              <w:rPr>
+                <w:rFonts w:ascii="Calibri" w:hAnsi="Calibri"/>
+                <w:b/>
+                <w:sz w:val="19"/>
+              </w:rPr>
+              <w:t>2. Stop all three services</w:t>
+            </w:r>
+          </w:p>
+        </w:tc>
+        <w:tc>
+          <w:tcPr>
+            <w:tcW w:type="dxa" w:w="4703"/>
+            <w:shd w:val="clear" w:color="auto" w:fill="FFFFFF"/>
+            <w:tcBorders>
+              <w:top w:val="single" w:sz="4" w:space="0" w:color="BFBFBF"/>
+              <w:left w:val="single" w:sz="4" w:space="0" w:color="BFBFBF"/>
+              <w:bottom w:val="single" w:sz="4" w:space="0" w:color="BFBFBF"/>
+              <w:right w:val="single" w:sz="4" w:space="0" w:color="BFBFBF"/>
+            </w:tcBorders>
+          </w:tcPr>
+          <w:p>
+            <w:r>
+              <w:rPr>
+                <w:rFonts w:ascii="Calibri" w:hAnsi="Calibri"/>
+                <w:sz w:val="19"/>
+              </w:rPr>
+              <w:t>sc.exe stops VideoServerSecuritiService, FlaskSecuritiService, and NginxSecuritiService in reverse dependency order. This releases the exclusive file lock each service holds on its own .exe, allowing files to be overwritten.</w:t>
+            </w:r>
+          </w:p>
+        </w:tc>
+      </w:tr>
+      <w:tr>
+        <w:tc>
+          <w:tcPr>
+            <w:tcW w:type="dxa" w:w="4703"/>
+            <w:shd w:val="clear" w:color="auto" w:fill="E8E8F5"/>
+            <w:tcBorders>
+              <w:top w:val="single" w:sz="4" w:space="0" w:color="BFBFBF"/>
+              <w:left w:val="single" w:sz="4" w:space="0" w:color="BFBFBF"/>
+              <w:bottom w:val="single" w:sz="4" w:space="0" w:color="BFBFBF"/>
+              <w:right w:val="single" w:sz="4" w:space="0" w:color="BFBFBF"/>
+            </w:tcBorders>
+          </w:tcPr>
+          <w:p>
+            <w:r>
+              <w:rPr>
+                <w:rFonts w:ascii="Calibri" w:hAnsi="Calibri"/>
+                <w:b/>
+                <w:sz w:val="19"/>
+              </w:rPr>
+              <w:t>3. Overwrite binary files</w:t>
+            </w:r>
+          </w:p>
+        </w:tc>
+        <w:tc>
+          <w:tcPr>
+            <w:tcW w:type="dxa" w:w="4703"/>
+            <w:shd w:val="clear" w:color="auto" w:fill="FFFFFF"/>
+            <w:tcBorders>
+              <w:top w:val="single" w:sz="4" w:space="0" w:color="BFBFBF"/>
+              <w:left w:val="single" w:sz="4" w:space="0" w:color="BFBFBF"/>
+              <w:bottom w:val="single" w:sz="4" w:space="0" w:color="BFBFBF"/>
+              <w:right w:val="single" w:sz="4" w:space="0" w:color="BFBFBF"/>
+            </w:tcBorders>
+          </w:tcPr>
+          <w:p>
+            <w:r>
+              <w:rPr>
+                <w:rFonts w:ascii="Calibri" w:hAnsi="Calibri"/>
+                <w:sz w:val="19"/>
+              </w:rPr>
+              <w:t>All application files are replaced: video_server.exe, SecuritiFlaskServer.exe, nginx.exe, all DLLs, all AI model files, and Nginx config. Only software files in Program Files are touched — nothing in ProgramData is written to.</w:t>
+            </w:r>
+          </w:p>
+        </w:tc>
+      </w:tr>
+      <w:tr>
+        <w:tc>
+          <w:tcPr>
+            <w:tcW w:type="dxa" w:w="4703"/>
+            <w:shd w:val="clear" w:color="auto" w:fill="E8E8F5"/>
+            <w:tcBorders>
+              <w:top w:val="single" w:sz="4" w:space="0" w:color="BFBFBF"/>
+              <w:left w:val="single" w:sz="4" w:space="0" w:color="BFBFBF"/>
+              <w:bottom w:val="single" w:sz="4" w:space="0" w:color="BFBFBF"/>
+              <w:right w:val="single" w:sz="4" w:space="0" w:color="BFBFBF"/>
+            </w:tcBorders>
+          </w:tcPr>
+          <w:p>
+            <w:r>
+              <w:rPr>
+                <w:rFonts w:ascii="Calibri" w:hAnsi="Calibri"/>
+                <w:b/>
+                <w:sz w:val="19"/>
+              </w:rPr>
+              <w:t>4. Skip nssm install</w:t>
+            </w:r>
+          </w:p>
+        </w:tc>
+        <w:tc>
+          <w:tcPr>
+            <w:tcW w:type="dxa" w:w="4703"/>
+            <w:shd w:val="clear" w:color="auto" w:fill="FFFFFF"/>
+            <w:tcBorders>
+              <w:top w:val="single" w:sz="4" w:space="0" w:color="BFBFBF"/>
+              <w:left w:val="single" w:sz="4" w:space="0" w:color="BFBFBF"/>
+              <w:bottom w:val="single" w:sz="4" w:space="0" w:color="BFBFBF"/>
+              <w:right w:val="single" w:sz="4" w:space="0" w:color="BFBFBF"/>
+            </w:tcBorders>
+          </w:tcPr>
+          <w:p>
+            <w:r>
+              <w:rPr>
+                <w:rFonts w:ascii="Calibri" w:hAnsi="Calibri"/>
+                <w:sz w:val="19"/>
+              </w:rPr>
+              <w:t>The nssm install commands are skipped (they are guarded with Check: IsFreshInstall). The services are already registered — re-registering them would error.</w:t>
+            </w:r>
+          </w:p>
+        </w:tc>
+      </w:tr>
+      <w:tr>
+        <w:tc>
+          <w:tcPr>
+            <w:tcW w:type="dxa" w:w="4703"/>
+            <w:shd w:val="clear" w:color="auto" w:fill="E8E8F5"/>
+            <w:tcBorders>
+              <w:top w:val="single" w:sz="4" w:space="0" w:color="BFBFBF"/>
+              <w:left w:val="single" w:sz="4" w:space="0" w:color="BFBFBF"/>
+              <w:bottom w:val="single" w:sz="4" w:space="0" w:color="BFBFBF"/>
+              <w:right w:val="single" w:sz="4" w:space="0" w:color="BFBFBF"/>
+            </w:tcBorders>
+          </w:tcPr>
+          <w:p>
+            <w:r>
+              <w:rPr>
+                <w:rFonts w:ascii="Calibri" w:hAnsi="Calibri"/>
+                <w:b/>
+                <w:sz w:val="19"/>
+              </w:rPr>
+              <w:t>5. Update service config</w:t>
+            </w:r>
+          </w:p>
+        </w:tc>
+        <w:tc>
+          <w:tcPr>
+            <w:tcW w:type="dxa" w:w="4703"/>
+            <w:shd w:val="clear" w:color="auto" w:fill="FFFFFF"/>
+            <w:tcBorders>
+              <w:top w:val="single" w:sz="4" w:space="0" w:color="BFBFBF"/>
+              <w:left w:val="single" w:sz="4" w:space="0" w:color="BFBFBF"/>
+              <w:bottom w:val="single" w:sz="4" w:space="0" w:color="BFBFBF"/>
+              <w:right w:val="single" w:sz="4" w:space="0" w:color="BFBFBF"/>
+            </w:tcBorders>
+          </w:tcPr>
+          <w:p>
+            <w:r>
+              <w:rPr>
+                <w:rFonts w:ascii="Calibri" w:hAnsi="Calibri"/>
+                <w:sz w:val="19"/>
+              </w:rPr>
+              <w:t>All nssm set commands still run. These update service properties (AppDirectory, log paths, rotation settings) in case anything changed between versions.</w:t>
+            </w:r>
+          </w:p>
+        </w:tc>
+      </w:tr>
+      <w:tr>
+        <w:tc>
+          <w:tcPr>
+            <w:tcW w:type="dxa" w:w="4703"/>
+            <w:shd w:val="clear" w:color="auto" w:fill="E8E8F5"/>
+            <w:tcBorders>
+              <w:top w:val="single" w:sz="4" w:space="0" w:color="BFBFBF"/>
+              <w:left w:val="single" w:sz="4" w:space="0" w:color="BFBFBF"/>
+              <w:bottom w:val="single" w:sz="4" w:space="0" w:color="BFBFBF"/>
+              <w:right w:val="single" w:sz="4" w:space="0" w:color="BFBFBF"/>
+            </w:tcBorders>
+          </w:tcPr>
+          <w:p>
+            <w:r>
+              <w:rPr>
+                <w:rFonts w:ascii="Calibri" w:hAnsi="Calibri"/>
+                <w:b/>
+                <w:sz w:val="19"/>
+              </w:rPr>
+              <w:t>6. Restart services</w:t>
+            </w:r>
+          </w:p>
+        </w:tc>
+        <w:tc>
+          <w:tcPr>
+            <w:tcW w:type="dxa" w:w="4703"/>
+            <w:shd w:val="clear" w:color="auto" w:fill="FFFFFF"/>
+            <w:tcBorders>
+              <w:top w:val="single" w:sz="4" w:space="0" w:color="BFBFBF"/>
+              <w:left w:val="single" w:sz="4" w:space="0" w:color="BFBFBF"/>
+              <w:bottom w:val="single" w:sz="4" w:space="0" w:color="BFBFBF"/>
+              <w:right w:val="single" w:sz="4" w:space="0" w:color="BFBFBF"/>
+            </w:tcBorders>
+          </w:tcPr>
+          <w:p>
+            <w:r>
+              <w:rPr>
+                <w:rFonts w:ascii="Calibri" w:hAnsi="Calibri"/>
+                <w:sz w:val="19"/>
+              </w:rPr>
+              <w:t>nssm start runs for all three services in order: Nginx → Flask → VideoServer. Services come back up running the new binaries.</w:t>
+            </w:r>
+          </w:p>
+        </w:tc>
+      </w:tr>
+      <w:tr>
+        <w:tc>
+          <w:tcPr>
+            <w:tcW w:type="dxa" w:w="4703"/>
+            <w:shd w:val="clear" w:color="auto" w:fill="E8E8F5"/>
+            <w:tcBorders>
+              <w:top w:val="single" w:sz="4" w:space="0" w:color="BFBFBF"/>
+              <w:left w:val="single" w:sz="4" w:space="0" w:color="BFBFBF"/>
+              <w:bottom w:val="single" w:sz="4" w:space="0" w:color="BFBFBF"/>
+              <w:right w:val="single" w:sz="4" w:space="0" w:color="BFBFBF"/>
+            </w:tcBorders>
+          </w:tcPr>
+          <w:p>
+            <w:r>
+              <w:rPr>
+                <w:rFonts w:ascii="Calibri" w:hAnsi="Calibri"/>
+                <w:b/>
+                <w:sz w:val="19"/>
+              </w:rPr>
+              <w:t>7. Show upgrade confirmation</w:t>
+            </w:r>
+          </w:p>
+        </w:tc>
+        <w:tc>
+          <w:tcPr>
+            <w:tcW w:type="dxa" w:w="4703"/>
+            <w:shd w:val="clear" w:color="auto" w:fill="FFFFFF"/>
+            <w:tcBorders>
+              <w:top w:val="single" w:sz="4" w:space="0" w:color="BFBFBF"/>
+              <w:left w:val="single" w:sz="4" w:space="0" w:color="BFBFBF"/>
+              <w:bottom w:val="single" w:sz="4" w:space="0" w:color="BFBFBF"/>
+              <w:right w:val="single" w:sz="4" w:space="0" w:color="BFBFBF"/>
+            </w:tcBorders>
+          </w:tcPr>
+          <w:p>
+            <w:r>
+              <w:rPr>
+                <w:rFonts w:ascii="Calibri" w:hAnsi="Calibri"/>
+                <w:sz w:val="19"/>
+              </w:rPr>
+              <w:t>"Securiti Desktop updated to v1.x.x successfully. Your cameras, users, identities, and all data have been preserved."</w:t>
+            </w:r>
+          </w:p>
+        </w:tc>
+      </w:tr>
+    </w:tbl>
+    <w:p/>
+    <w:p>
+      <w:pPr>
+        <w:spacing w:before="120" w:after="40"/>
+      </w:pPr>
+      <w:r>
+        <w:rPr>
+          <w:rFonts w:ascii="Calibri" w:hAnsi="Calibri"/>
+          <w:b/>
+          <w:color w:val="060061"/>
+          <w:sz w:val="26"/>
+        </w:rPr>
+        <w:t>What is NEVER touched during an upgrade</w:t>
+      </w:r>
+    </w:p>
+    <w:tbl>
+      <w:tblPr>
+        <w:tblStyle w:val="TableGrid"/>
+        <w:tblW w:type="auto" w:w="0"/>
+        <w:tblLook w:firstColumn="1" w:firstRow="1" w:lastColumn="0" w:lastRow="0" w:noHBand="0" w:noVBand="1" w:val="04A0"/>
+      </w:tblPr>
+      <w:tblGrid>
+        <w:gridCol w:w="4703"/>
+        <w:gridCol w:w="4703"/>
+      </w:tblGrid>
+      <w:tr>
+        <w:tc>
+          <w:tcPr>
+            <w:tcW w:type="dxa" w:w="4703"/>
+            <w:shd w:val="clear" w:color="auto" w:fill="060061"/>
+            <w:tcBorders>
+              <w:top w:val="single" w:sz="4" w:space="0" w:color="060061"/>
+              <w:left w:val="single" w:sz="4" w:space="0" w:color="060061"/>
+              <w:bottom w:val="single" w:sz="4" w:space="0" w:color="060061"/>
+              <w:right w:val="single" w:sz="4" w:space="0" w:color="060061"/>
+            </w:tcBorders>
+          </w:tcPr>
+          <w:p>
+            <w:r>
+              <w:rPr>
+                <w:rFonts w:ascii="Calibri" w:hAnsi="Calibri"/>
+                <w:b/>
+                <w:color w:val="FFFFFF"/>
+                <w:sz w:val="19"/>
+              </w:rPr>
+              <w:t>Data</w:t>
+            </w:r>
+          </w:p>
+        </w:tc>
+        <w:tc>
+          <w:tcPr>
+            <w:tcW w:type="dxa" w:w="4703"/>
+            <w:shd w:val="clear" w:color="auto" w:fill="060061"/>
+            <w:tcBorders>
+              <w:top w:val="single" w:sz="4" w:space="0" w:color="060061"/>
+              <w:left w:val="single" w:sz="4" w:space="0" w:color="060061"/>
+              <w:bottom w:val="single" w:sz="4" w:space="0" w:color="060061"/>
+              <w:right w:val="single" w:sz="4" w:space="0" w:color="060061"/>
+            </w:tcBorders>
+          </w:tcPr>
+          <w:p>
+            <w:r>
+              <w:rPr>
+                <w:rFonts w:ascii="Calibri" w:hAnsi="Calibri"/>
+                <w:b/>
+                <w:color w:val="FFFFFF"/>
+                <w:sz w:val="19"/>
+              </w:rPr>
+              <w:t>Location / Detail</w:t>
+            </w:r>
+          </w:p>
+        </w:tc>
+      </w:tr>
+      <w:tr>
+        <w:tc>
+          <w:tcPr>
+            <w:tcW w:type="dxa" w:w="4703"/>
+            <w:shd w:val="clear" w:color="auto" w:fill="E8E8F5"/>
+            <w:tcBorders>
+              <w:top w:val="single" w:sz="4" w:space="0" w:color="BFBFBF"/>
+              <w:left w:val="single" w:sz="4" w:space="0" w:color="BFBFBF"/>
+              <w:bottom w:val="single" w:sz="4" w:space="0" w:color="BFBFBF"/>
+              <w:right w:val="single" w:sz="4" w:space="0" w:color="BFBFBF"/>
+            </w:tcBorders>
+          </w:tcPr>
+          <w:p>
+            <w:r>
+              <w:rPr>
+                <w:rFonts w:ascii="Calibri" w:hAnsi="Calibri"/>
+                <w:b/>
+                <w:sz w:val="19"/>
+              </w:rPr>
+              <w:t>securiti.db</w:t>
+            </w:r>
+          </w:p>
+        </w:tc>
+        <w:tc>
+          <w:tcPr>
+            <w:tcW w:type="dxa" w:w="4703"/>
+            <w:shd w:val="clear" w:color="auto" w:fill="FFFFFF"/>
+            <w:tcBorders>
+              <w:top w:val="single" w:sz="4" w:space="0" w:color="BFBFBF"/>
+              <w:left w:val="single" w:sz="4" w:space="0" w:color="BFBFBF"/>
+              <w:bottom w:val="single" w:sz="4" w:space="0" w:color="BFBFBF"/>
+              <w:right w:val="single" w:sz="4" w:space="0" w:color="BFBFBF"/>
+            </w:tcBorders>
+          </w:tcPr>
+          <w:p>
+            <w:r>
+              <w:rPr>
+                <w:rFonts w:ascii="Calibri" w:hAnsi="Calibri"/>
+                <w:sz w:val="19"/>
+              </w:rPr>
+              <w:t>The SQLite database at C:\ProgramData\Securiti Desktop\data\securiti.db. Contains: cameras, stream tokens, face embeddings, identities, identity sightings, security zones, security rules, security alerts, notifications, sessions.</w:t>
+            </w:r>
+          </w:p>
+        </w:tc>
+      </w:tr>
+      <w:tr>
+        <w:tc>
+          <w:tcPr>
+            <w:tcW w:type="dxa" w:w="4703"/>
+            <w:shd w:val="clear" w:color="auto" w:fill="E8E8F5"/>
+            <w:tcBorders>
+              <w:top w:val="single" w:sz="4" w:space="0" w:color="BFBFBF"/>
+              <w:left w:val="single" w:sz="4" w:space="0" w:color="BFBFBF"/>
+              <w:bottom w:val="single" w:sz="4" w:space="0" w:color="BFBFBF"/>
+              <w:right w:val="single" w:sz="4" w:space="0" w:color="BFBFBF"/>
+            </w:tcBorders>
+          </w:tcPr>
+          <w:p>
+            <w:r>
+              <w:rPr>
+                <w:rFonts w:ascii="Calibri" w:hAnsi="Calibri"/>
+                <w:b/>
+                <w:sz w:val="19"/>
+              </w:rPr>
+              <w:t>ServerLogs\ and VideoServerLogs\</w:t>
+            </w:r>
+          </w:p>
+        </w:tc>
+        <w:tc>
+          <w:tcPr>
+            <w:tcW w:type="dxa" w:w="4703"/>
+            <w:shd w:val="clear" w:color="auto" w:fill="FFFFFF"/>
+            <w:tcBorders>
+              <w:top w:val="single" w:sz="4" w:space="0" w:color="BFBFBF"/>
+              <w:left w:val="single" w:sz="4" w:space="0" w:color="BFBFBF"/>
+              <w:bottom w:val="single" w:sz="4" w:space="0" w:color="BFBFBF"/>
+              <w:right w:val="single" w:sz="4" w:space="0" w:color="BFBFBF"/>
+            </w:tcBorders>
+          </w:tcPr>
+          <w:p>
+            <w:r>
+              <w:rPr>
+                <w:rFonts w:ascii="Calibri" w:hAnsi="Calibri"/>
+                <w:sz w:val="19"/>
+              </w:rPr>
+              <w:t>Log files are never deleted or truncated by the installer.</w:t>
+            </w:r>
+          </w:p>
+        </w:tc>
+      </w:tr>
+      <w:tr>
+        <w:tc>
+          <w:tcPr>
+            <w:tcW w:type="dxa" w:w="4703"/>
+            <w:shd w:val="clear" w:color="auto" w:fill="E8E8F5"/>
+            <w:tcBorders>
+              <w:top w:val="single" w:sz="4" w:space="0" w:color="BFBFBF"/>
+              <w:left w:val="single" w:sz="4" w:space="0" w:color="BFBFBF"/>
+              <w:bottom w:val="single" w:sz="4" w:space="0" w:color="BFBFBF"/>
+              <w:right w:val="single" w:sz="4" w:space="0" w:color="BFBFBF"/>
+            </w:tcBorders>
+          </w:tcPr>
+          <w:p>
+            <w:r>
+              <w:rPr>
+                <w:rFonts w:ascii="Calibri" w:hAnsi="Calibri"/>
+                <w:b/>
+                <w:sz w:val="19"/>
+              </w:rPr>
+              <w:t>Firebase credentials</w:t>
+            </w:r>
+          </w:p>
+        </w:tc>
+        <w:tc>
+          <w:tcPr>
+            <w:tcW w:type="dxa" w:w="4703"/>
+            <w:shd w:val="clear" w:color="auto" w:fill="FFFFFF"/>
+            <w:tcBorders>
+              <w:top w:val="single" w:sz="4" w:space="0" w:color="BFBFBF"/>
+              <w:left w:val="single" w:sz="4" w:space="0" w:color="BFBFBF"/>
+              <w:bottom w:val="single" w:sz="4" w:space="0" w:color="BFBFBF"/>
+              <w:right w:val="single" w:sz="4" w:space="0" w:color="BFBFBF"/>
+            </w:tcBorders>
+          </w:tcPr>
+          <w:p>
+            <w:r>
+              <w:rPr>
+                <w:rFonts w:ascii="Calibri" w:hAnsi="Calibri"/>
+                <w:sz w:val="19"/>
+              </w:rPr>
+              <w:t>Any credential or key files stored in ProgramData are untouched.</w:t>
+            </w:r>
+          </w:p>
+        </w:tc>
+      </w:tr>
+      <w:tr>
+        <w:tc>
+          <w:tcPr>
+            <w:tcW w:type="dxa" w:w="4703"/>
+            <w:shd w:val="clear" w:color="auto" w:fill="E8E8F5"/>
+            <w:tcBorders>
+              <w:top w:val="single" w:sz="4" w:space="0" w:color="BFBFBF"/>
+              <w:left w:val="single" w:sz="4" w:space="0" w:color="BFBFBF"/>
+              <w:bottom w:val="single" w:sz="4" w:space="0" w:color="BFBFBF"/>
+              <w:right w:val="single" w:sz="4" w:space="0" w:color="BFBFBF"/>
+            </w:tcBorders>
+          </w:tcPr>
+          <w:p>
+            <w:r>
+              <w:rPr>
+                <w:rFonts w:ascii="Calibri" w:hAnsi="Calibri"/>
+                <w:b/>
+                <w:sz w:val="19"/>
+              </w:rPr>
+              <w:t>LocalX tunnel config</w:t>
+            </w:r>
+          </w:p>
+        </w:tc>
+        <w:tc>
+          <w:tcPr>
+            <w:tcW w:type="dxa" w:w="4703"/>
+            <w:shd w:val="clear" w:color="auto" w:fill="FFFFFF"/>
+            <w:tcBorders>
+              <w:top w:val="single" w:sz="4" w:space="0" w:color="BFBFBF"/>
+              <w:left w:val="single" w:sz="4" w:space="0" w:color="BFBFBF"/>
+              <w:bottom w:val="single" w:sz="4" w:space="0" w:color="BFBFBF"/>
+              <w:right w:val="single" w:sz="4" w:space="0" w:color="BFBFBF"/>
+            </w:tcBorders>
+          </w:tcPr>
+          <w:p>
+            <w:r>
+              <w:rPr>
+                <w:rFonts w:ascii="Calibri" w:hAnsi="Calibri"/>
+                <w:sz w:val="19"/>
+              </w:rPr>
+              <w:t>Tunnel registration and config files bundled in the Flask server folder survive because the installer uses ignoreversion — it overwrites the binary but leaves config files the server wrote at runtime alone.</w:t>
+            </w:r>
+          </w:p>
+        </w:tc>
+      </w:tr>
+    </w:tbl>
+    <w:p/>
+    <w:p>
+      <w:pPr>
+        <w:spacing w:before="120" w:after="40"/>
+      </w:pPr>
+      <w:r>
+        <w:rPr>
+          <w:rFonts w:ascii="Calibri" w:hAnsi="Calibri"/>
+          <w:b/>
+          <w:color w:val="060061"/>
+          <w:sz w:val="26"/>
+        </w:rPr>
+        <w:t>What IS replaced during an upgrade</w:t>
+      </w:r>
+    </w:p>
+    <w:tbl>
+      <w:tblPr>
+        <w:tblStyle w:val="TableGrid"/>
+        <w:tblW w:type="auto" w:w="0"/>
+        <w:tblLook w:firstColumn="1" w:firstRow="1" w:lastColumn="0" w:lastRow="0" w:noHBand="0" w:noVBand="1" w:val="04A0"/>
+      </w:tblPr>
+      <w:tblGrid>
+        <w:gridCol w:w="4703"/>
+        <w:gridCol w:w="4703"/>
+      </w:tblGrid>
+      <w:tr>
+        <w:tc>
+          <w:tcPr>
+            <w:tcW w:type="dxa" w:w="4703"/>
+            <w:shd w:val="clear" w:color="auto" w:fill="060061"/>
+            <w:tcBorders>
+              <w:top w:val="single" w:sz="4" w:space="0" w:color="060061"/>
+              <w:left w:val="single" w:sz="4" w:space="0" w:color="060061"/>
+              <w:bottom w:val="single" w:sz="4" w:space="0" w:color="060061"/>
+              <w:right w:val="single" w:sz="4" w:space="0" w:color="060061"/>
+            </w:tcBorders>
+          </w:tcPr>
+          <w:p>
+            <w:r>
+              <w:rPr>
+                <w:rFonts w:ascii="Calibri" w:hAnsi="Calibri"/>
+                <w:b/>
+                <w:color w:val="FFFFFF"/>
+                <w:sz w:val="19"/>
+              </w:rPr>
+              <w:t>File(s)</w:t>
+            </w:r>
+          </w:p>
+        </w:tc>
+        <w:tc>
+          <w:tcPr>
+            <w:tcW w:type="dxa" w:w="4703"/>
+            <w:shd w:val="clear" w:color="auto" w:fill="060061"/>
+            <w:tcBorders>
+              <w:top w:val="single" w:sz="4" w:space="0" w:color="060061"/>
+              <w:left w:val="single" w:sz="4" w:space="0" w:color="060061"/>
+              <w:bottom w:val="single" w:sz="4" w:space="0" w:color="060061"/>
+              <w:right w:val="single" w:sz="4" w:space="0" w:color="060061"/>
+            </w:tcBorders>
+          </w:tcPr>
+          <w:p>
+            <w:r>
+              <w:rPr>
+                <w:rFonts w:ascii="Calibri" w:hAnsi="Calibri"/>
+                <w:b/>
+                <w:color w:val="FFFFFF"/>
+                <w:sz w:val="19"/>
+              </w:rPr>
+              <w:t>Location</w:t>
+            </w:r>
+          </w:p>
+        </w:tc>
+      </w:tr>
+      <w:tr>
+        <w:tc>
+          <w:tcPr>
+            <w:tcW w:type="dxa" w:w="4703"/>
+            <w:shd w:val="clear" w:color="auto" w:fill="E8E8F5"/>
+            <w:tcBorders>
+              <w:top w:val="single" w:sz="4" w:space="0" w:color="BFBFBF"/>
+              <w:left w:val="single" w:sz="4" w:space="0" w:color="BFBFBF"/>
+              <w:bottom w:val="single" w:sz="4" w:space="0" w:color="BFBFBF"/>
+              <w:right w:val="single" w:sz="4" w:space="0" w:color="BFBFBF"/>
+            </w:tcBorders>
+          </w:tcPr>
+          <w:p>
+            <w:r>
+              <w:rPr>
+                <w:rFonts w:ascii="Calibri" w:hAnsi="Calibri"/>
+                <w:b/>
+                <w:sz w:val="19"/>
+              </w:rPr>
+              <w:t>video_server.exe</w:t>
+            </w:r>
+          </w:p>
+        </w:tc>
+        <w:tc>
+          <w:tcPr>
+            <w:tcW w:type="dxa" w:w="4703"/>
+            <w:shd w:val="clear" w:color="auto" w:fill="FFFFFF"/>
+            <w:tcBorders>
+              <w:top w:val="single" w:sz="4" w:space="0" w:color="BFBFBF"/>
+              <w:left w:val="single" w:sz="4" w:space="0" w:color="BFBFBF"/>
+              <w:bottom w:val="single" w:sz="4" w:space="0" w:color="BFBFBF"/>
+              <w:right w:val="single" w:sz="4" w:space="0" w:color="BFBFBF"/>
+            </w:tcBorders>
+          </w:tcPr>
+          <w:p>
+            <w:r>
+              <w:rPr>
+                <w:rFonts w:ascii="Calibri" w:hAnsi="Calibri"/>
+                <w:sz w:val="19"/>
+              </w:rPr>
+              <w:t>C:\Program Files\Securiti Desktop\VideoServer\</w:t>
+            </w:r>
+          </w:p>
+        </w:tc>
+      </w:tr>
+      <w:tr>
+        <w:tc>
+          <w:tcPr>
+            <w:tcW w:type="dxa" w:w="4703"/>
+            <w:shd w:val="clear" w:color="auto" w:fill="E8E8F5"/>
+            <w:tcBorders>
+              <w:top w:val="single" w:sz="4" w:space="0" w:color="BFBFBF"/>
+              <w:left w:val="single" w:sz="4" w:space="0" w:color="BFBFBF"/>
+              <w:bottom w:val="single" w:sz="4" w:space="0" w:color="BFBFBF"/>
+              <w:right w:val="single" w:sz="4" w:space="0" w:color="BFBFBF"/>
+            </w:tcBorders>
+          </w:tcPr>
+          <w:p>
+            <w:r>
+              <w:rPr>
+                <w:rFonts w:ascii="Calibri" w:hAnsi="Calibri"/>
+                <w:b/>
+                <w:sz w:val="19"/>
+              </w:rPr>
+              <w:t>SecuritiFlaskServer.exe + all PyInstaller files</w:t>
+            </w:r>
+          </w:p>
+        </w:tc>
+        <w:tc>
+          <w:tcPr>
+            <w:tcW w:type="dxa" w:w="4703"/>
+            <w:shd w:val="clear" w:color="auto" w:fill="FFFFFF"/>
+            <w:tcBorders>
+              <w:top w:val="single" w:sz="4" w:space="0" w:color="BFBFBF"/>
+              <w:left w:val="single" w:sz="4" w:space="0" w:color="BFBFBF"/>
+              <w:bottom w:val="single" w:sz="4" w:space="0" w:color="BFBFBF"/>
+              <w:right w:val="single" w:sz="4" w:space="0" w:color="BFBFBF"/>
+            </w:tcBorders>
+          </w:tcPr>
+          <w:p>
+            <w:r>
+              <w:rPr>
+                <w:rFonts w:ascii="Calibri" w:hAnsi="Calibri"/>
+                <w:sz w:val="19"/>
+              </w:rPr>
+              <w:t>C:\Program Files\Securiti Desktop\Server\</w:t>
+            </w:r>
+          </w:p>
+        </w:tc>
+      </w:tr>
+      <w:tr>
+        <w:tc>
+          <w:tcPr>
+            <w:tcW w:type="dxa" w:w="4703"/>
+            <w:shd w:val="clear" w:color="auto" w:fill="E8E8F5"/>
+            <w:tcBorders>
+              <w:top w:val="single" w:sz="4" w:space="0" w:color="BFBFBF"/>
+              <w:left w:val="single" w:sz="4" w:space="0" w:color="BFBFBF"/>
+              <w:bottom w:val="single" w:sz="4" w:space="0" w:color="BFBFBF"/>
+              <w:right w:val="single" w:sz="4" w:space="0" w:color="BFBFBF"/>
+            </w:tcBorders>
+          </w:tcPr>
+          <w:p>
+            <w:r>
+              <w:rPr>
+                <w:rFonts w:ascii="Calibri" w:hAnsi="Calibri"/>
+                <w:b/>
+                <w:sz w:val="19"/>
+              </w:rPr>
+              <w:t>nginx.exe + nginx.conf</w:t>
+            </w:r>
+          </w:p>
+        </w:tc>
+        <w:tc>
+          <w:tcPr>
+            <w:tcW w:type="dxa" w:w="4703"/>
+            <w:shd w:val="clear" w:color="auto" w:fill="FFFFFF"/>
+            <w:tcBorders>
+              <w:top w:val="single" w:sz="4" w:space="0" w:color="BFBFBF"/>
+              <w:left w:val="single" w:sz="4" w:space="0" w:color="BFBFBF"/>
+              <w:bottom w:val="single" w:sz="4" w:space="0" w:color="BFBFBF"/>
+              <w:right w:val="single" w:sz="4" w:space="0" w:color="BFBFBF"/>
+            </w:tcBorders>
+          </w:tcPr>
+          <w:p>
+            <w:r>
+              <w:rPr>
+                <w:rFonts w:ascii="Calibri" w:hAnsi="Calibri"/>
+                <w:sz w:val="19"/>
+              </w:rPr>
+              <w:t>C:\Program Files\Securiti Desktop\Nginx\</w:t>
+            </w:r>
+          </w:p>
+        </w:tc>
+      </w:tr>
+      <w:tr>
+        <w:tc>
+          <w:tcPr>
+            <w:tcW w:type="dxa" w:w="4703"/>
+            <w:shd w:val="clear" w:color="auto" w:fill="E8E8F5"/>
+            <w:tcBorders>
+              <w:top w:val="single" w:sz="4" w:space="0" w:color="BFBFBF"/>
+              <w:left w:val="single" w:sz="4" w:space="0" w:color="BFBFBF"/>
+              <w:bottom w:val="single" w:sz="4" w:space="0" w:color="BFBFBF"/>
+              <w:right w:val="single" w:sz="4" w:space="0" w:color="BFBFBF"/>
+            </w:tcBorders>
+          </w:tcPr>
+          <w:p>
+            <w:r>
+              <w:rPr>
+                <w:rFonts w:ascii="Calibri" w:hAnsi="Calibri"/>
+                <w:b/>
+                <w:sz w:val="19"/>
+              </w:rPr>
+              <w:t>All DLL files</w:t>
+            </w:r>
+          </w:p>
+        </w:tc>
+        <w:tc>
+          <w:tcPr>
+            <w:tcW w:type="dxa" w:w="4703"/>
+            <w:shd w:val="clear" w:color="auto" w:fill="FFFFFF"/>
+            <w:tcBorders>
+              <w:top w:val="single" w:sz="4" w:space="0" w:color="BFBFBF"/>
+              <w:left w:val="single" w:sz="4" w:space="0" w:color="BFBFBF"/>
+              <w:bottom w:val="single" w:sz="4" w:space="0" w:color="BFBFBF"/>
+              <w:right w:val="single" w:sz="4" w:space="0" w:color="BFBFBF"/>
+            </w:tcBorders>
+          </w:tcPr>
+          <w:p>
+            <w:r>
+              <w:rPr>
+                <w:rFonts w:ascii="Calibri" w:hAnsi="Calibri"/>
+                <w:sz w:val="19"/>
+              </w:rPr>
+              <w:t>C:\Program Files\Securiti Desktop\VideoServer\*.dll</w:t>
+            </w:r>
+          </w:p>
+        </w:tc>
+      </w:tr>
+      <w:tr>
+        <w:tc>
+          <w:tcPr>
+            <w:tcW w:type="dxa" w:w="4703"/>
+            <w:shd w:val="clear" w:color="auto" w:fill="E8E8F5"/>
+            <w:tcBorders>
+              <w:top w:val="single" w:sz="4" w:space="0" w:color="BFBFBF"/>
+              <w:left w:val="single" w:sz="4" w:space="0" w:color="BFBFBF"/>
+              <w:bottom w:val="single" w:sz="4" w:space="0" w:color="BFBFBF"/>
+              <w:right w:val="single" w:sz="4" w:space="0" w:color="BFBFBF"/>
+            </w:tcBorders>
+          </w:tcPr>
+          <w:p>
+            <w:r>
+              <w:rPr>
+                <w:rFonts w:ascii="Calibri" w:hAnsi="Calibri"/>
+                <w:b/>
+                <w:sz w:val="19"/>
+              </w:rPr>
+              <w:t>All AI model files (.onnx)</w:t>
+            </w:r>
+          </w:p>
+        </w:tc>
+        <w:tc>
+          <w:tcPr>
+            <w:tcW w:type="dxa" w:w="4703"/>
+            <w:shd w:val="clear" w:color="auto" w:fill="FFFFFF"/>
+            <w:tcBorders>
+              <w:top w:val="single" w:sz="4" w:space="0" w:color="BFBFBF"/>
+              <w:left w:val="single" w:sz="4" w:space="0" w:color="BFBFBF"/>
+              <w:bottom w:val="single" w:sz="4" w:space="0" w:color="BFBFBF"/>
+              <w:right w:val="single" w:sz="4" w:space="0" w:color="BFBFBF"/>
+            </w:tcBorders>
+          </w:tcPr>
+          <w:p>
+            <w:r>
+              <w:rPr>
+                <w:rFonts w:ascii="Calibri" w:hAnsi="Calibri"/>
+                <w:sz w:val="19"/>
+              </w:rPr>
+              <w:t>C:\Program Files\Securiti Desktop\VideoServer\models\</w:t>
+            </w:r>
+          </w:p>
+        </w:tc>
+      </w:tr>
+      <w:tr>
+        <w:tc>
+          <w:tcPr>
+            <w:tcW w:type="dxa" w:w="4703"/>
+            <w:shd w:val="clear" w:color="auto" w:fill="E8E8F5"/>
+            <w:tcBorders>
+              <w:top w:val="single" w:sz="4" w:space="0" w:color="BFBFBF"/>
+              <w:left w:val="single" w:sz="4" w:space="0" w:color="BFBFBF"/>
+              <w:bottom w:val="single" w:sz="4" w:space="0" w:color="BFBFBF"/>
+              <w:right w:val="single" w:sz="4" w:space="0" w:color="BFBFBF"/>
+            </w:tcBorders>
+          </w:tcPr>
+          <w:p>
+            <w:r>
+              <w:rPr>
+                <w:rFonts w:ascii="Calibri" w:hAnsi="Calibri"/>
+                <w:b/>
+                <w:sz w:val="19"/>
+              </w:rPr>
+              <w:t>nssm.exe</w:t>
+            </w:r>
+          </w:p>
+        </w:tc>
+        <w:tc>
+          <w:tcPr>
+            <w:tcW w:type="dxa" w:w="4703"/>
+            <w:shd w:val="clear" w:color="auto" w:fill="FFFFFF"/>
+            <w:tcBorders>
+              <w:top w:val="single" w:sz="4" w:space="0" w:color="BFBFBF"/>
+              <w:left w:val="single" w:sz="4" w:space="0" w:color="BFBFBF"/>
+              <w:bottom w:val="single" w:sz="4" w:space="0" w:color="BFBFBF"/>
+              <w:right w:val="single" w:sz="4" w:space="0" w:color="BFBFBF"/>
+            </w:tcBorders>
+          </w:tcPr>
+          <w:p>
+            <w:r>
+              <w:rPr>
+                <w:rFonts w:ascii="Calibri" w:hAnsi="Calibri"/>
+                <w:sz w:val="19"/>
+              </w:rPr>
+              <w:t>C:\Program Files\Securiti Desktop\NSSM\</w:t>
+            </w:r>
+          </w:p>
+        </w:tc>
+      </w:tr>
+    </w:tbl>
+    <w:p/>
+    <w:p>
+      <w:pPr>
+        <w:spacing w:before="120" w:after="40"/>
+      </w:pPr>
+      <w:r>
+        <w:rPr>
+          <w:rFonts w:ascii="Calibri" w:hAnsi="Calibri"/>
+          <w:b/>
+          <w:color w:val="060061"/>
+          <w:sz w:val="26"/>
+        </w:rPr>
+        <w:t>How the installer tells fresh install from upgrade</w:t>
+      </w:r>
+    </w:p>
+    <w:p>
+      <w:pPr>
+        <w:spacing w:before="0" w:after="80"/>
+      </w:pPr>
+      <w:r>
+        <w:rPr>
+          <w:rFonts w:ascii="Calibri" w:hAnsi="Calibri"/>
+          <w:color w:val="1F1F1F"/>
+          <w:sz w:val="20"/>
+        </w:rPr>
+        <w:t>Inno Setup writes an uninstall registry key the first time the software is installed. On every subsequent run the installer checks for this key:</w:t>
+      </w:r>
+    </w:p>
+    <w:tbl>
+      <w:tblPr>
+        <w:tblStyle w:val="TableGrid"/>
+        <w:tblW w:type="auto" w:w="0"/>
+        <w:tblLook w:firstColumn="1" w:firstRow="1" w:lastColumn="0" w:lastRow="0" w:noHBand="0" w:noVBand="1" w:val="04A0"/>
+      </w:tblPr>
+      <w:tblGrid>
+        <w:gridCol w:w="9406"/>
+      </w:tblGrid>
+      <w:tr>
+        <w:tc>
+          <w:tcPr>
+            <w:tcW w:type="dxa" w:w="9406"/>
+            <w:shd w:val="clear" w:color="auto" w:fill="F3F4F6"/>
+            <w:tcBorders>
+              <w:top w:val="single" w:sz="4" w:space="0" w:color="D1D5DB"/>
+              <w:left w:val="single" w:sz="4" w:space="0" w:color="D1D5DB"/>
+              <w:bottom w:val="single" w:sz="4" w:space="0" w:color="D1D5DB"/>
+              <w:right w:val="single" w:sz="4" w:space="0" w:color="D1D5DB"/>
+            </w:tcBorders>
+          </w:tcPr>
+          <w:p>
+            <w:pPr>
+              <w:spacing w:before="0" w:after="0"/>
+            </w:pPr>
+            <w:r>
+              <w:rPr>
+                <w:rFonts w:ascii="Courier New" w:hAnsi="Courier New"/>
+                <w:color w:val="111827"/>
+                <w:sz w:val="17"/>
+              </w:rPr>
+              <w:t>HKLM\Software\Microsoft\Windows\CurrentVersion\Uninstall\</w:t>
+            </w:r>
+          </w:p>
+          <w:p>
+            <w:pPr>
+              <w:spacing w:before="0" w:after="0"/>
+            </w:pPr>
+            <w:r>
+              <w:rPr>
+                <w:rFonts w:ascii="Courier New" w:hAnsi="Courier New"/>
+                <w:color w:val="111827"/>
+                <w:sz w:val="17"/>
+              </w:rPr>
+              <w:t>{8F3A2D1E-7B4C-4E9F-A6D2-1C8E5F0B3A97}_is1</w:t>
+            </w:r>
+          </w:p>
+          <w:p>
+            <w:pPr>
+              <w:spacing w:before="0" w:after="0"/>
+            </w:pPr>
+            <w:r>
+              <w:rPr>
+                <w:rFonts w:ascii="Courier New" w:hAnsi="Courier New"/>
+                <w:color w:val="111827"/>
+                <w:sz w:val="17"/>
+              </w:rPr>
+              <w:t xml:space="preserve"> </w:t>
+            </w:r>
+          </w:p>
+          <w:p>
+            <w:pPr>
+              <w:spacing w:before="0" w:after="0"/>
+            </w:pPr>
+            <w:r>
+              <w:rPr>
+                <w:rFonts w:ascii="Courier New" w:hAnsi="Courier New"/>
+                <w:color w:val="111827"/>
+                <w:sz w:val="17"/>
+              </w:rPr>
+              <w:t>Key present   → IsUpgrade() = True  → upgrade mode</w:t>
+            </w:r>
+          </w:p>
+          <w:p>
+            <w:pPr>
+              <w:spacing w:before="0" w:after="0"/>
+            </w:pPr>
+            <w:r>
+              <w:rPr>
+                <w:rFonts w:ascii="Courier New" w:hAnsi="Courier New"/>
+                <w:color w:val="111827"/>
+                <w:sz w:val="17"/>
+              </w:rPr>
+              <w:t>Key absent    → IsUpgrade() = False → fresh install mode</w:t>
+            </w:r>
+          </w:p>
+        </w:tc>
+      </w:tr>
+    </w:tbl>
+    <w:p/>
+    <w:tbl>
+      <w:tblPr>
+        <w:tblStyle w:val="TableGrid"/>
+        <w:tblW w:type="auto" w:w="0"/>
+        <w:tblLook w:firstColumn="1" w:firstRow="1" w:lastColumn="0" w:lastRow="0" w:noHBand="0" w:noVBand="1" w:val="04A0"/>
+      </w:tblPr>
+      <w:tblGrid>
+        <w:gridCol w:w="9406"/>
+      </w:tblGrid>
+      <w:tr>
+        <w:tc>
+          <w:tcPr>
+            <w:tcW w:type="dxa" w:w="9406"/>
+            <w:shd w:val="clear" w:color="auto" w:fill="E8E8F5"/>
+            <w:tcBorders>
+              <w:top w:val="single" w:sz="4" w:space="0" w:color="060061"/>
+              <w:left w:val="single" w:sz="4" w:space="0" w:color="060061"/>
+              <w:bottom w:val="single" w:sz="4" w:space="0" w:color="060061"/>
+              <w:right w:val="single" w:sz="4" w:space="0" w:color="060061"/>
+            </w:tcBorders>
+          </w:tcPr>
+          <w:p>
+            <w:pPr>
+              <w:spacing w:before="60" w:after="60"/>
+            </w:pPr>
+            <w:r>
+              <w:rPr>
+                <w:rFonts w:ascii="Calibri" w:hAnsi="Calibri"/>
+                <w:sz w:val="19"/>
+              </w:rPr>
+              <w:t>The AppId GUID (8F3A2D1E-7B4C-4E9F-A6D2-1C8E5F0B3A97) is fixed in SecuritiInstallerV1.iss and must never change. Changing it would make the installer treat every upgrade as a fresh install and wipe the database.</w:t>
+            </w:r>
+          </w:p>
+        </w:tc>
+      </w:tr>
+    </w:tbl>
+    <w:p/>
+    <w:p>
+      <w:pPr>
+        <w:spacing w:before="120" w:after="40"/>
+      </w:pPr>
+      <w:r>
+        <w:rPr>
+          <w:rFonts w:ascii="Calibri" w:hAnsi="Calibri"/>
+          <w:b/>
+          <w:color w:val="060061"/>
+          <w:sz w:val="26"/>
+        </w:rPr>
+        <w:t>Fresh install vs upgrade — side by side</w:t>
+      </w:r>
+    </w:p>
+    <w:tbl>
+      <w:tblPr>
+        <w:tblStyle w:val="TableGrid"/>
+        <w:tblW w:type="auto" w:w="0"/>
+        <w:tblLook w:firstColumn="1" w:firstRow="1" w:lastColumn="0" w:lastRow="0" w:noHBand="0" w:noVBand="1" w:val="04A0"/>
+      </w:tblPr>
+      <w:tblGrid>
+        <w:gridCol w:w="3135"/>
+        <w:gridCol w:w="3135"/>
+        <w:gridCol w:w="3135"/>
+      </w:tblGrid>
+      <w:tr>
+        <w:tc>
+          <w:tcPr>
+            <w:tcW w:type="dxa" w:w="3135"/>
+            <w:shd w:val="clear" w:color="auto" w:fill="060061"/>
+            <w:tcBorders>
+              <w:top w:val="single" w:sz="4" w:space="0" w:color="060061"/>
+              <w:left w:val="single" w:sz="4" w:space="0" w:color="060061"/>
+              <w:bottom w:val="single" w:sz="4" w:space="0" w:color="060061"/>
+              <w:right w:val="single" w:sz="4" w:space="0" w:color="060061"/>
+            </w:tcBorders>
+          </w:tcPr>
+          <w:p>
+            <w:r>
+              <w:rPr>
+                <w:rFonts w:ascii="Calibri" w:hAnsi="Calibri"/>
+                <w:b/>
+                <w:color w:val="FFFFFF"/>
+                <w:sz w:val="19"/>
+              </w:rPr>
+              <w:t>Action</w:t>
+            </w:r>
+          </w:p>
+        </w:tc>
+        <w:tc>
+          <w:tcPr>
+            <w:tcW w:type="dxa" w:w="3135"/>
+            <w:shd w:val="clear" w:color="auto" w:fill="060061"/>
+            <w:tcBorders>
+              <w:top w:val="single" w:sz="4" w:space="0" w:color="060061"/>
+              <w:left w:val="single" w:sz="4" w:space="0" w:color="060061"/>
+              <w:bottom w:val="single" w:sz="4" w:space="0" w:color="060061"/>
+              <w:right w:val="single" w:sz="4" w:space="0" w:color="060061"/>
+            </w:tcBorders>
+          </w:tcPr>
+          <w:p>
+            <w:r>
+              <w:rPr>
+                <w:rFonts w:ascii="Calibri" w:hAnsi="Calibri"/>
+                <w:b/>
+                <w:color w:val="FFFFFF"/>
+                <w:sz w:val="19"/>
+              </w:rPr>
+              <w:t>Fresh Install</w:t>
+            </w:r>
+          </w:p>
+        </w:tc>
+        <w:tc>
+          <w:tcPr>
+            <w:tcW w:type="dxa" w:w="3135"/>
+            <w:shd w:val="clear" w:color="auto" w:fill="060061"/>
+            <w:tcBorders>
+              <w:top w:val="single" w:sz="4" w:space="0" w:color="060061"/>
+              <w:left w:val="single" w:sz="4" w:space="0" w:color="060061"/>
+              <w:bottom w:val="single" w:sz="4" w:space="0" w:color="060061"/>
+              <w:right w:val="single" w:sz="4" w:space="0" w:color="060061"/>
+            </w:tcBorders>
+          </w:tcPr>
+          <w:p>
+            <w:r>
+              <w:rPr>
+                <w:rFonts w:ascii="Calibri" w:hAnsi="Calibri"/>
+                <w:b/>
+                <w:color w:val="FFFFFF"/>
+                <w:sz w:val="19"/>
+              </w:rPr>
+              <w:t>Upgrade</w:t>
+            </w:r>
+          </w:p>
+        </w:tc>
+      </w:tr>
+      <w:tr>
+        <w:tc>
+          <w:tcPr>
+            <w:tcW w:type="dxa" w:w="3135"/>
+            <w:shd w:val="clear" w:color="auto" w:fill="E8E8F5"/>
+            <w:tcBorders>
+              <w:top w:val="single" w:sz="4" w:space="0" w:color="BFBFBF"/>
+              <w:left w:val="single" w:sz="4" w:space="0" w:color="BFBFBF"/>
+              <w:bottom w:val="single" w:sz="4" w:space="0" w:color="BFBFBF"/>
+              <w:right w:val="single" w:sz="4" w:space="0" w:color="BFBFBF"/>
+            </w:tcBorders>
+          </w:tcPr>
+          <w:p>
+            <w:r>
+              <w:rPr>
+                <w:rFonts w:ascii="Calibri" w:hAnsi="Calibri"/>
+                <w:b/>
+                <w:sz w:val="19"/>
+              </w:rPr>
+              <w:t>Detects existing install</w:t>
+            </w:r>
+          </w:p>
+        </w:tc>
+        <w:tc>
+          <w:tcPr>
+            <w:tcW w:type="dxa" w:w="3135"/>
+            <w:shd w:val="clear" w:color="auto" w:fill="FFFFFF"/>
+            <w:tcBorders>
+              <w:top w:val="single" w:sz="4" w:space="0" w:color="BFBFBF"/>
+              <w:left w:val="single" w:sz="4" w:space="0" w:color="BFBFBF"/>
+              <w:bottom w:val="single" w:sz="4" w:space="0" w:color="BFBFBF"/>
+              <w:right w:val="single" w:sz="4" w:space="0" w:color="BFBFBF"/>
+            </w:tcBorders>
+          </w:tcPr>
+          <w:p>
+            <w:r>
+              <w:rPr>
+                <w:rFonts w:ascii="Calibri" w:hAnsi="Calibri"/>
+                <w:sz w:val="19"/>
+              </w:rPr>
+              <w:t>No (first run)</w:t>
+            </w:r>
+          </w:p>
+        </w:tc>
+        <w:tc>
+          <w:tcPr>
+            <w:tcW w:type="dxa" w:w="3135"/>
+            <w:shd w:val="clear" w:color="auto" w:fill="FFFFFF"/>
+            <w:tcBorders>
+              <w:top w:val="single" w:sz="4" w:space="0" w:color="BFBFBF"/>
+              <w:left w:val="single" w:sz="4" w:space="0" w:color="BFBFBF"/>
+              <w:bottom w:val="single" w:sz="4" w:space="0" w:color="BFBFBF"/>
+              <w:right w:val="single" w:sz="4" w:space="0" w:color="BFBFBF"/>
+            </w:tcBorders>
+          </w:tcPr>
+          <w:p>
+            <w:r>
+              <w:rPr>
+                <w:rFonts w:ascii="Calibri" w:hAnsi="Calibri"/>
+                <w:sz w:val="19"/>
+              </w:rPr>
+              <w:t>Yes (registry key present)</w:t>
+            </w:r>
+          </w:p>
+        </w:tc>
+      </w:tr>
+      <w:tr>
+        <w:tc>
+          <w:tcPr>
+            <w:tcW w:type="dxa" w:w="3135"/>
+            <w:shd w:val="clear" w:color="auto" w:fill="E8E8F5"/>
+            <w:tcBorders>
+              <w:top w:val="single" w:sz="4" w:space="0" w:color="BFBFBF"/>
+              <w:left w:val="single" w:sz="4" w:space="0" w:color="BFBFBF"/>
+              <w:bottom w:val="single" w:sz="4" w:space="0" w:color="BFBFBF"/>
+              <w:right w:val="single" w:sz="4" w:space="0" w:color="BFBFBF"/>
+            </w:tcBorders>
+          </w:tcPr>
+          <w:p>
+            <w:r>
+              <w:rPr>
+                <w:rFonts w:ascii="Calibri" w:hAnsi="Calibri"/>
+                <w:b/>
+                <w:sz w:val="19"/>
+              </w:rPr>
+              <w:t>Stops running services</w:t>
+            </w:r>
+          </w:p>
+        </w:tc>
+        <w:tc>
+          <w:tcPr>
+            <w:tcW w:type="dxa" w:w="3135"/>
+            <w:shd w:val="clear" w:color="auto" w:fill="FFFFFF"/>
+            <w:tcBorders>
+              <w:top w:val="single" w:sz="4" w:space="0" w:color="BFBFBF"/>
+              <w:left w:val="single" w:sz="4" w:space="0" w:color="BFBFBF"/>
+              <w:bottom w:val="single" w:sz="4" w:space="0" w:color="BFBFBF"/>
+              <w:right w:val="single" w:sz="4" w:space="0" w:color="BFBFBF"/>
+            </w:tcBorders>
+          </w:tcPr>
+          <w:p>
+            <w:r>
+              <w:rPr>
+                <w:rFonts w:ascii="Calibri" w:hAnsi="Calibri"/>
+                <w:sz w:val="19"/>
+              </w:rPr>
+              <w:t>Yes (safe no-op if not installed)</w:t>
+            </w:r>
+          </w:p>
+        </w:tc>
+        <w:tc>
+          <w:tcPr>
+            <w:tcW w:type="dxa" w:w="3135"/>
+            <w:shd w:val="clear" w:color="auto" w:fill="FFFFFF"/>
+            <w:tcBorders>
+              <w:top w:val="single" w:sz="4" w:space="0" w:color="BFBFBF"/>
+              <w:left w:val="single" w:sz="4" w:space="0" w:color="BFBFBF"/>
+              <w:bottom w:val="single" w:sz="4" w:space="0" w:color="BFBFBF"/>
+              <w:right w:val="single" w:sz="4" w:space="0" w:color="BFBFBF"/>
+            </w:tcBorders>
+          </w:tcPr>
+          <w:p>
+            <w:r>
+              <w:rPr>
+                <w:rFonts w:ascii="Calibri" w:hAnsi="Calibri"/>
+                <w:sz w:val="19"/>
+              </w:rPr>
+              <w:t>Yes (required to unlock files)</w:t>
+            </w:r>
+          </w:p>
+        </w:tc>
+      </w:tr>
+      <w:tr>
+        <w:tc>
+          <w:tcPr>
+            <w:tcW w:type="dxa" w:w="3135"/>
+            <w:shd w:val="clear" w:color="auto" w:fill="E8E8F5"/>
+            <w:tcBorders>
+              <w:top w:val="single" w:sz="4" w:space="0" w:color="BFBFBF"/>
+              <w:left w:val="single" w:sz="4" w:space="0" w:color="BFBFBF"/>
+              <w:bottom w:val="single" w:sz="4" w:space="0" w:color="BFBFBF"/>
+              <w:right w:val="single" w:sz="4" w:space="0" w:color="BFBFBF"/>
+            </w:tcBorders>
+          </w:tcPr>
+          <w:p>
+            <w:r>
+              <w:rPr>
+                <w:rFonts w:ascii="Calibri" w:hAnsi="Calibri"/>
+                <w:b/>
+                <w:sz w:val="19"/>
+              </w:rPr>
+              <w:t>Wipes securiti.db</w:t>
+            </w:r>
+          </w:p>
+        </w:tc>
+        <w:tc>
+          <w:tcPr>
+            <w:tcW w:type="dxa" w:w="3135"/>
+            <w:shd w:val="clear" w:color="auto" w:fill="FFFFFF"/>
+            <w:tcBorders>
+              <w:top w:val="single" w:sz="4" w:space="0" w:color="BFBFBF"/>
+              <w:left w:val="single" w:sz="4" w:space="0" w:color="BFBFBF"/>
+              <w:bottom w:val="single" w:sz="4" w:space="0" w:color="BFBFBF"/>
+              <w:right w:val="single" w:sz="4" w:space="0" w:color="BFBFBF"/>
+            </w:tcBorders>
+          </w:tcPr>
+          <w:p>
+            <w:r>
+              <w:rPr>
+                <w:rFonts w:ascii="Calibri" w:hAnsi="Calibri"/>
+                <w:sz w:val="19"/>
+              </w:rPr>
+              <w:t>Yes (clears stale dev data)</w:t>
+            </w:r>
+          </w:p>
+        </w:tc>
+        <w:tc>
+          <w:tcPr>
+            <w:tcW w:type="dxa" w:w="3135"/>
+            <w:shd w:val="clear" w:color="auto" w:fill="FFFFFF"/>
+            <w:tcBorders>
+              <w:top w:val="single" w:sz="4" w:space="0" w:color="BFBFBF"/>
+              <w:left w:val="single" w:sz="4" w:space="0" w:color="BFBFBF"/>
+              <w:bottom w:val="single" w:sz="4" w:space="0" w:color="BFBFBF"/>
+              <w:right w:val="single" w:sz="4" w:space="0" w:color="BFBFBF"/>
+            </w:tcBorders>
+          </w:tcPr>
+          <w:p>
+            <w:r>
+              <w:rPr>
+                <w:rFonts w:ascii="Calibri" w:hAnsi="Calibri"/>
+                <w:sz w:val="19"/>
+              </w:rPr>
+              <w:t>No — database is preserved</w:t>
+            </w:r>
+          </w:p>
+        </w:tc>
+      </w:tr>
+      <w:tr>
+        <w:tc>
+          <w:tcPr>
+            <w:tcW w:type="dxa" w:w="3135"/>
+            <w:shd w:val="clear" w:color="auto" w:fill="E8E8F5"/>
+            <w:tcBorders>
+              <w:top w:val="single" w:sz="4" w:space="0" w:color="BFBFBF"/>
+              <w:left w:val="single" w:sz="4" w:space="0" w:color="BFBFBF"/>
+              <w:bottom w:val="single" w:sz="4" w:space="0" w:color="BFBFBF"/>
+              <w:right w:val="single" w:sz="4" w:space="0" w:color="BFBFBF"/>
+            </w:tcBorders>
+          </w:tcPr>
+          <w:p>
+            <w:r>
+              <w:rPr>
+                <w:rFonts w:ascii="Calibri" w:hAnsi="Calibri"/>
+                <w:b/>
+                <w:sz w:val="19"/>
+              </w:rPr>
+              <w:t>Runs nssm install</w:t>
+            </w:r>
+          </w:p>
+        </w:tc>
+        <w:tc>
+          <w:tcPr>
+            <w:tcW w:type="dxa" w:w="3135"/>
+            <w:shd w:val="clear" w:color="auto" w:fill="FFFFFF"/>
+            <w:tcBorders>
+              <w:top w:val="single" w:sz="4" w:space="0" w:color="BFBFBF"/>
+              <w:left w:val="single" w:sz="4" w:space="0" w:color="BFBFBF"/>
+              <w:bottom w:val="single" w:sz="4" w:space="0" w:color="BFBFBF"/>
+              <w:right w:val="single" w:sz="4" w:space="0" w:color="BFBFBF"/>
+            </w:tcBorders>
+          </w:tcPr>
+          <w:p>
+            <w:r>
+              <w:rPr>
+                <w:rFonts w:ascii="Calibri" w:hAnsi="Calibri"/>
+                <w:sz w:val="19"/>
+              </w:rPr>
+              <w:t>Yes (registers new services)</w:t>
+            </w:r>
+          </w:p>
+        </w:tc>
+        <w:tc>
+          <w:tcPr>
+            <w:tcW w:type="dxa" w:w="3135"/>
+            <w:shd w:val="clear" w:color="auto" w:fill="FFFFFF"/>
+            <w:tcBorders>
+              <w:top w:val="single" w:sz="4" w:space="0" w:color="BFBFBF"/>
+              <w:left w:val="single" w:sz="4" w:space="0" w:color="BFBFBF"/>
+              <w:bottom w:val="single" w:sz="4" w:space="0" w:color="BFBFBF"/>
+              <w:right w:val="single" w:sz="4" w:space="0" w:color="BFBFBF"/>
+            </w:tcBorders>
+          </w:tcPr>
+          <w:p>
+            <w:r>
+              <w:rPr>
+                <w:rFonts w:ascii="Calibri" w:hAnsi="Calibri"/>
+                <w:sz w:val="19"/>
+              </w:rPr>
+              <w:t>No — services already exist</w:t>
+            </w:r>
+          </w:p>
+        </w:tc>
+      </w:tr>
+      <w:tr>
+        <w:tc>
+          <w:tcPr>
+            <w:tcW w:type="dxa" w:w="3135"/>
+            <w:shd w:val="clear" w:color="auto" w:fill="E8E8F5"/>
+            <w:tcBorders>
+              <w:top w:val="single" w:sz="4" w:space="0" w:color="BFBFBF"/>
+              <w:left w:val="single" w:sz="4" w:space="0" w:color="BFBFBF"/>
+              <w:bottom w:val="single" w:sz="4" w:space="0" w:color="BFBFBF"/>
+              <w:right w:val="single" w:sz="4" w:space="0" w:color="BFBFBF"/>
+            </w:tcBorders>
+          </w:tcPr>
+          <w:p>
+            <w:r>
+              <w:rPr>
+                <w:rFonts w:ascii="Calibri" w:hAnsi="Calibri"/>
+                <w:b/>
+                <w:sz w:val="19"/>
+              </w:rPr>
+              <w:t>Runs nssm set (config update)</w:t>
+            </w:r>
+          </w:p>
+        </w:tc>
+        <w:tc>
+          <w:tcPr>
+            <w:tcW w:type="dxa" w:w="3135"/>
+            <w:shd w:val="clear" w:color="auto" w:fill="FFFFFF"/>
+            <w:tcBorders>
+              <w:top w:val="single" w:sz="4" w:space="0" w:color="BFBFBF"/>
+              <w:left w:val="single" w:sz="4" w:space="0" w:color="BFBFBF"/>
+              <w:bottom w:val="single" w:sz="4" w:space="0" w:color="BFBFBF"/>
+              <w:right w:val="single" w:sz="4" w:space="0" w:color="BFBFBF"/>
+            </w:tcBorders>
+          </w:tcPr>
+          <w:p>
+            <w:r>
+              <w:rPr>
+                <w:rFonts w:ascii="Calibri" w:hAnsi="Calibri"/>
+                <w:sz w:val="19"/>
+              </w:rPr>
+              <w:t>Yes</w:t>
+            </w:r>
+          </w:p>
+        </w:tc>
+        <w:tc>
+          <w:tcPr>
+            <w:tcW w:type="dxa" w:w="3135"/>
+            <w:shd w:val="clear" w:color="auto" w:fill="FFFFFF"/>
+            <w:tcBorders>
+              <w:top w:val="single" w:sz="4" w:space="0" w:color="BFBFBF"/>
+              <w:left w:val="single" w:sz="4" w:space="0" w:color="BFBFBF"/>
+              <w:bottom w:val="single" w:sz="4" w:space="0" w:color="BFBFBF"/>
+              <w:right w:val="single" w:sz="4" w:space="0" w:color="BFBFBF"/>
+            </w:tcBorders>
+          </w:tcPr>
+          <w:p>
+            <w:r>
+              <w:rPr>
+                <w:rFonts w:ascii="Calibri" w:hAnsi="Calibri"/>
+                <w:sz w:val="19"/>
+              </w:rPr>
+              <w:t>Yes</w:t>
+            </w:r>
+          </w:p>
+        </w:tc>
+      </w:tr>
+      <w:tr>
+        <w:tc>
+          <w:tcPr>
+            <w:tcW w:type="dxa" w:w="3135"/>
+            <w:shd w:val="clear" w:color="auto" w:fill="E8E8F5"/>
+            <w:tcBorders>
+              <w:top w:val="single" w:sz="4" w:space="0" w:color="BFBFBF"/>
+              <w:left w:val="single" w:sz="4" w:space="0" w:color="BFBFBF"/>
+              <w:bottom w:val="single" w:sz="4" w:space="0" w:color="BFBFBF"/>
+              <w:right w:val="single" w:sz="4" w:space="0" w:color="BFBFBF"/>
+            </w:tcBorders>
+          </w:tcPr>
+          <w:p>
+            <w:r>
+              <w:rPr>
+                <w:rFonts w:ascii="Calibri" w:hAnsi="Calibri"/>
+                <w:b/>
+                <w:sz w:val="19"/>
+              </w:rPr>
+              <w:t>Starts services</w:t>
+            </w:r>
+          </w:p>
+        </w:tc>
+        <w:tc>
+          <w:tcPr>
+            <w:tcW w:type="dxa" w:w="3135"/>
+            <w:shd w:val="clear" w:color="auto" w:fill="FFFFFF"/>
+            <w:tcBorders>
+              <w:top w:val="single" w:sz="4" w:space="0" w:color="BFBFBF"/>
+              <w:left w:val="single" w:sz="4" w:space="0" w:color="BFBFBF"/>
+              <w:bottom w:val="single" w:sz="4" w:space="0" w:color="BFBFBF"/>
+              <w:right w:val="single" w:sz="4" w:space="0" w:color="BFBFBF"/>
+            </w:tcBorders>
+          </w:tcPr>
+          <w:p>
+            <w:r>
+              <w:rPr>
+                <w:rFonts w:ascii="Calibri" w:hAnsi="Calibri"/>
+                <w:sz w:val="19"/>
+              </w:rPr>
+              <w:t>Yes</w:t>
+            </w:r>
+          </w:p>
+        </w:tc>
+        <w:tc>
+          <w:tcPr>
+            <w:tcW w:type="dxa" w:w="3135"/>
+            <w:shd w:val="clear" w:color="auto" w:fill="FFFFFF"/>
+            <w:tcBorders>
+              <w:top w:val="single" w:sz="4" w:space="0" w:color="BFBFBF"/>
+              <w:left w:val="single" w:sz="4" w:space="0" w:color="BFBFBF"/>
+              <w:bottom w:val="single" w:sz="4" w:space="0" w:color="BFBFBF"/>
+              <w:right w:val="single" w:sz="4" w:space="0" w:color="BFBFBF"/>
+            </w:tcBorders>
+          </w:tcPr>
+          <w:p>
+            <w:r>
+              <w:rPr>
+                <w:rFonts w:ascii="Calibri" w:hAnsi="Calibri"/>
+                <w:sz w:val="19"/>
+              </w:rPr>
+              <w:t>Yes (restarts them)</w:t>
+            </w:r>
+          </w:p>
+        </w:tc>
+      </w:tr>
+      <w:tr>
+        <w:tc>
+          <w:tcPr>
+            <w:tcW w:type="dxa" w:w="3135"/>
+            <w:shd w:val="clear" w:color="auto" w:fill="E8E8F5"/>
+            <w:tcBorders>
+              <w:top w:val="single" w:sz="4" w:space="0" w:color="BFBFBF"/>
+              <w:left w:val="single" w:sz="4" w:space="0" w:color="BFBFBF"/>
+              <w:bottom w:val="single" w:sz="4" w:space="0" w:color="BFBFBF"/>
+              <w:right w:val="single" w:sz="4" w:space="0" w:color="BFBFBF"/>
+            </w:tcBorders>
+          </w:tcPr>
+          <w:p>
+            <w:r>
+              <w:rPr>
+                <w:rFonts w:ascii="Calibri" w:hAnsi="Calibri"/>
+                <w:b/>
+                <w:sz w:val="19"/>
+              </w:rPr>
+              <w:t>Success message</w:t>
+            </w:r>
+          </w:p>
+        </w:tc>
+        <w:tc>
+          <w:tcPr>
+            <w:tcW w:type="dxa" w:w="3135"/>
+            <w:shd w:val="clear" w:color="auto" w:fill="FFFFFF"/>
+            <w:tcBorders>
+              <w:top w:val="single" w:sz="4" w:space="0" w:color="BFBFBF"/>
+              <w:left w:val="single" w:sz="4" w:space="0" w:color="BFBFBF"/>
+              <w:bottom w:val="single" w:sz="4" w:space="0" w:color="BFBFBF"/>
+              <w:right w:val="single" w:sz="4" w:space="0" w:color="BFBFBF"/>
+            </w:tcBorders>
+          </w:tcPr>
+          <w:p>
+            <w:r>
+              <w:rPr>
+                <w:rFonts w:ascii="Calibri" w:hAnsi="Calibri"/>
+                <w:sz w:val="19"/>
+              </w:rPr>
+              <w:t>"Installed successfully"</w:t>
+            </w:r>
+          </w:p>
+        </w:tc>
+        <w:tc>
+          <w:tcPr>
+            <w:tcW w:type="dxa" w:w="3135"/>
+            <w:shd w:val="clear" w:color="auto" w:fill="FFFFFF"/>
+            <w:tcBorders>
+              <w:top w:val="single" w:sz="4" w:space="0" w:color="BFBFBF"/>
+              <w:left w:val="single" w:sz="4" w:space="0" w:color="BFBFBF"/>
+              <w:bottom w:val="single" w:sz="4" w:space="0" w:color="BFBFBF"/>
+              <w:right w:val="single" w:sz="4" w:space="0" w:color="BFBFBF"/>
+            </w:tcBorders>
+          </w:tcPr>
+          <w:p>
+            <w:r>
+              <w:rPr>
+                <w:rFonts w:ascii="Calibri" w:hAnsi="Calibri"/>
+                <w:sz w:val="19"/>
+              </w:rPr>
+              <w:t>"Updated to vX.X.X — data preserved"</w:t>
+            </w:r>
+          </w:p>
+        </w:tc>
+      </w:tr>
+    </w:tbl>
+    <w:p/>
+    <w:p/>
+    <w:tbl>
+      <w:tblPr>
+        <w:tblStyle w:val="TableGrid"/>
+        <w:tblW w:type="auto" w:w="0"/>
+        <w:tblLook w:firstColumn="1" w:firstRow="1" w:lastColumn="0" w:lastRow="0" w:noHBand="0" w:noVBand="1" w:val="04A0"/>
+      </w:tblPr>
+      <w:tblGrid>
+        <w:gridCol w:w="9406"/>
+      </w:tblGrid>
+      <w:tr>
+        <w:tc>
+          <w:tcPr>
+            <w:tcW w:type="dxa" w:w="9406"/>
+            <w:shd w:val="clear" w:color="auto" w:fill="060061"/>
+            <w:tcBorders>
+              <w:top w:val="single" w:sz="6" w:space="0" w:color="060061"/>
+              <w:left w:val="single" w:sz="6" w:space="0" w:color="060061"/>
+              <w:bottom w:val="single" w:sz="6" w:space="0" w:color="060061"/>
+              <w:right w:val="single" w:sz="6" w:space="0" w:color="060061"/>
+            </w:tcBorders>
+          </w:tcPr>
+          <w:p>
+            <w:pPr>
+              <w:spacing w:before="80" w:after="80"/>
+              <w:jc w:val="left"/>
+            </w:pPr>
+            <w:r>
+              <w:rPr>
+                <w:rFonts w:ascii="Calibri" w:hAnsi="Calibri"/>
+                <w:b/>
+                <w:color w:val="FFFFFF"/>
+                <w:sz w:val="22"/>
+              </w:rPr>
+              <w:t>4  RELEASE CHECKLIST  (PRINT AND TICK OFF EACH TIME)</w:t>
             </w:r>
           </w:p>
         </w:tc>
@@ -2802,7 +4594,7 @@
                 <w:color w:val="FFFFFF"/>
                 <w:sz w:val="22"/>
               </w:rPr>
-              <w:t>4  WHAT UPDATES AUTOMATICALLY VS WHAT YOU DO MANUALLY</w:t>
+              <w:t>5  WHAT UPDATES AUTOMATICALLY VS WHAT YOU DO MANUALLY</w:t>
             </w:r>
           </w:p>
         </w:tc>
@@ -3397,7 +5189,7 @@
                 <w:color w:val="FFFFFF"/>
                 <w:sz w:val="22"/>
               </w:rPr>
-              <w:t>5  COMMON MISTAKES TO AVOID</w:t>
+              <w:t>6  COMMON MISTAKES TO AVOID</w:t>
             </w:r>
           </w:p>
         </w:tc>
@@ -3606,7 +5398,7 @@
                 <w:color w:val="FFFFFF"/>
                 <w:sz w:val="22"/>
               </w:rPr>
-              <w:t>6  KEY FILE PATHS &amp; URLS</w:t>
+              <w:t>7  KEY FILE PATHS &amp; URLS</w:t>
             </w:r>
           </w:p>
         </w:tc>

</xml_diff>

<commit_message>
docs: add AppId GUID warning to Common Mistakes — changing it wipes customer data on upgrade
</commit_message>
<xml_diff>
--- a/Securiti_Desktop_Release_Guide.docx
+++ b/Securiti_Desktop_Release_Guide.docx
@@ -5235,6 +5235,34 @@
           <w:color w:val="DC2626"/>
           <w:sz w:val="20"/>
         </w:rPr>
+        <w:t>✗  Changing the AppId GUID in SecuritiInstallerV1.iss</w:t>
+      </w:r>
+    </w:p>
+    <w:p>
+      <w:pPr>
+        <w:spacing w:before="0" w:after="120"/>
+        <w:ind w:left="454"/>
+      </w:pPr>
+      <w:r>
+        <w:rPr>
+          <w:rFonts w:ascii="Calibri" w:hAnsi="Calibri"/>
+          <w:color w:val="1F1F1F"/>
+          <w:sz w:val="19"/>
+        </w:rPr>
+        <w:t>The AppId {8F3A2D1E-7B4C-4E9F-A6D2-1C8E5F0B3A97} must never be changed. It is the key Inno Setup uses to detect an existing installation (IsUpgrade). If you change it, every upgrade will be treated as a fresh install — the installer will wipe securiti.db and all customer data: cameras, faces, identities, notifications, and accounts will be permanently deleted with no warning.</w:t>
+      </w:r>
+    </w:p>
+    <w:p>
+      <w:pPr>
+        <w:spacing w:before="80" w:after="0"/>
+      </w:pPr>
+      <w:r>
+        <w:rPr>
+          <w:rFonts w:ascii="Calibri" w:hAnsi="Calibri"/>
+          <w:b/>
+          <w:color w:val="DC2626"/>
+          <w:sz w:val="20"/>
+        </w:rPr>
         <w:t>✗  Leaving the release as a Draft</w:t>
       </w:r>
     </w:p>

</xml_diff>

<commit_message>
docs: Step 6 now references publish_release.ps1 instead of inline script
</commit_message>
<xml_diff>
--- a/Securiti_Desktop_Release_Guide.docx
+++ b/Securiti_Desktop_Release_Guide.docx
@@ -1492,7 +1492,20 @@
           <w:color w:val="1F1F1F"/>
           <w:sz w:val="20"/>
         </w:rPr>
-        <w:t>Run the PowerShell script below. Replace 1.3.0 with the new version number. The script creates the release, uploads the .exe, and publishes it in one go.</w:t>
+        <w:t>A ready-to-run PowerShell script handles the entire release in one go: creating the draft, uploading the installer, and publishing. There is only one line to edit before running it.</w:t>
+      </w:r>
+    </w:p>
+    <w:p>
+      <w:pPr>
+        <w:spacing w:before="0" w:after="80"/>
+      </w:pPr>
+      <w:r>
+        <w:rPr>
+          <w:rFonts w:ascii="Calibri" w:hAnsi="Calibri"/>
+          <w:color w:val="1F1F1F"/>
+          <w:sz w:val="20"/>
+        </w:rPr>
+        <w:t>Script location:</w:t>
       </w:r>
     </w:p>
     <w:tbl>
@@ -1526,7 +1539,109 @@
                 <w:color w:val="111827"/>
                 <w:sz w:val="17"/>
               </w:rPr>
-              <w:t>$token   = $(gh auth token)</w:t>
+              <w:t>python/securiti-desktop/installer_build/publish_release.ps1</w:t>
+            </w:r>
+          </w:p>
+        </w:tc>
+      </w:tr>
+    </w:tbl>
+    <w:p/>
+    <w:p>
+      <w:pPr>
+        <w:spacing w:before="0" w:after="80"/>
+      </w:pPr>
+      <w:r>
+        <w:rPr>
+          <w:rFonts w:ascii="Calibri" w:hAnsi="Calibri"/>
+          <w:color w:val="1F1F1F"/>
+          <w:sz w:val="20"/>
+        </w:rPr>
+        <w:t>The only line you need to edit is at the top of the script:</w:t>
+      </w:r>
+    </w:p>
+    <w:tbl>
+      <w:tblPr>
+        <w:tblStyle w:val="TableGrid"/>
+        <w:tblW w:type="auto" w:w="0"/>
+        <w:tblLook w:firstColumn="1" w:firstRow="1" w:lastColumn="0" w:lastRow="0" w:noHBand="0" w:noVBand="1" w:val="04A0"/>
+      </w:tblPr>
+      <w:tblGrid>
+        <w:gridCol w:w="9406"/>
+      </w:tblGrid>
+      <w:tr>
+        <w:tc>
+          <w:tcPr>
+            <w:tcW w:type="dxa" w:w="9406"/>
+            <w:shd w:val="clear" w:color="auto" w:fill="F3F4F6"/>
+            <w:tcBorders>
+              <w:top w:val="single" w:sz="4" w:space="0" w:color="D1D5DB"/>
+              <w:left w:val="single" w:sz="4" w:space="0" w:color="D1D5DB"/>
+              <w:bottom w:val="single" w:sz="4" w:space="0" w:color="D1D5DB"/>
+              <w:right w:val="single" w:sz="4" w:space="0" w:color="D1D5DB"/>
+            </w:tcBorders>
+          </w:tcPr>
+          <w:p>
+            <w:pPr>
+              <w:spacing w:before="0" w:after="0"/>
+            </w:pPr>
+            <w:r>
+              <w:rPr>
+                <w:rFonts w:ascii="Courier New" w:hAnsi="Courier New"/>
+                <w:color w:val="111827"/>
+                <w:sz w:val="17"/>
+              </w:rPr>
+              <w:t>$Version = "1.3.0"   # ← change this to match MyAppVersion in SecuritiInstallerV1.iss</w:t>
+            </w:r>
+          </w:p>
+        </w:tc>
+      </w:tr>
+    </w:tbl>
+    <w:p/>
+    <w:p>
+      <w:pPr>
+        <w:spacing w:before="0" w:after="80"/>
+      </w:pPr>
+      <w:r>
+        <w:rPr>
+          <w:rFonts w:ascii="Calibri" w:hAnsi="Calibri"/>
+          <w:color w:val="1F1F1F"/>
+          <w:sz w:val="20"/>
+        </w:rPr>
+        <w:t>Optionally update $ReleaseNotes in the same file to describe what changed. Then run the script from PowerShell:</w:t>
+      </w:r>
+    </w:p>
+    <w:tbl>
+      <w:tblPr>
+        <w:tblStyle w:val="TableGrid"/>
+        <w:tblW w:type="auto" w:w="0"/>
+        <w:tblLook w:firstColumn="1" w:firstRow="1" w:lastColumn="0" w:lastRow="0" w:noHBand="0" w:noVBand="1" w:val="04A0"/>
+      </w:tblPr>
+      <w:tblGrid>
+        <w:gridCol w:w="9406"/>
+      </w:tblGrid>
+      <w:tr>
+        <w:tc>
+          <w:tcPr>
+            <w:tcW w:type="dxa" w:w="9406"/>
+            <w:shd w:val="clear" w:color="auto" w:fill="F3F4F6"/>
+            <w:tcBorders>
+              <w:top w:val="single" w:sz="4" w:space="0" w:color="D1D5DB"/>
+              <w:left w:val="single" w:sz="4" w:space="0" w:color="D1D5DB"/>
+              <w:bottom w:val="single" w:sz="4" w:space="0" w:color="D1D5DB"/>
+              <w:right w:val="single" w:sz="4" w:space="0" w:color="D1D5DB"/>
+            </w:tcBorders>
+          </w:tcPr>
+          <w:p>
+            <w:pPr>
+              <w:spacing w:before="0" w:after="0"/>
+            </w:pPr>
+            <w:r>
+              <w:rPr>
+                <w:rFonts w:ascii="Courier New" w:hAnsi="Courier New"/>
+                <w:color w:val="111827"/>
+                <w:sz w:val="17"/>
+              </w:rPr>
+              <w:t>cd "C:\Users\domin\Workspace\python\securiti-desktop\installer_build"</w:t>
             </w:r>
           </w:p>
           <w:p>
@@ -1539,507 +1654,234 @@
                 <w:color w:val="111827"/>
                 <w:sz w:val="17"/>
               </w:rPr>
-              <w:t>$version = "1.3.0"    # ← change this to match MyAppVersion</w:t>
-            </w:r>
-          </w:p>
-          <w:p>
-            <w:pPr>
-              <w:spacing w:before="0" w:after="0"/>
-            </w:pPr>
-            <w:r>
-              <w:rPr>
-                <w:rFonts w:ascii="Courier New" w:hAnsi="Courier New"/>
-                <w:color w:val="111827"/>
-                <w:sz w:val="17"/>
-              </w:rPr>
-              <w:t>$file    = "C:\Users\domin\Workspace\python\securiti-desktop\installer_build\Output\Securiti_Desktop_Setup_$version.exe"</w:t>
-            </w:r>
-          </w:p>
-          <w:p>
-            <w:pPr>
-              <w:spacing w:before="0" w:after="0"/>
-            </w:pPr>
-            <w:r>
-              <w:rPr>
-                <w:rFonts w:ascii="Courier New" w:hAnsi="Courier New"/>
-                <w:color w:val="111827"/>
-                <w:sz w:val="17"/>
-              </w:rPr>
-              <w:t xml:space="preserve"> </w:t>
-            </w:r>
-          </w:p>
-          <w:p>
-            <w:pPr>
-              <w:spacing w:before="0" w:after="0"/>
-            </w:pPr>
-            <w:r>
-              <w:rPr>
-                <w:rFonts w:ascii="Courier New" w:hAnsi="Courier New"/>
-                <w:color w:val="111827"/>
-                <w:sz w:val="17"/>
-              </w:rPr>
-              <w:t>$headers = @{</w:t>
-            </w:r>
-          </w:p>
-          <w:p>
-            <w:pPr>
-              <w:spacing w:before="0" w:after="0"/>
-            </w:pPr>
-            <w:r>
-              <w:rPr>
-                <w:rFonts w:ascii="Courier New" w:hAnsi="Courier New"/>
-                <w:color w:val="111827"/>
-                <w:sz w:val="17"/>
-              </w:rPr>
-              <w:t xml:space="preserve">    "Authorization" = "token $token"</w:t>
-            </w:r>
-          </w:p>
-          <w:p>
-            <w:pPr>
-              <w:spacing w:before="0" w:after="0"/>
-            </w:pPr>
-            <w:r>
-              <w:rPr>
-                <w:rFonts w:ascii="Courier New" w:hAnsi="Courier New"/>
-                <w:color w:val="111827"/>
-                <w:sz w:val="17"/>
-              </w:rPr>
-              <w:t xml:space="preserve">    "Accept"        = "application/vnd.github+json"</w:t>
-            </w:r>
-          </w:p>
-          <w:p>
-            <w:pPr>
-              <w:spacing w:before="0" w:after="0"/>
-            </w:pPr>
-            <w:r>
-              <w:rPr>
-                <w:rFonts w:ascii="Courier New" w:hAnsi="Courier New"/>
-                <w:color w:val="111827"/>
-                <w:sz w:val="17"/>
-              </w:rPr>
-              <w:t xml:space="preserve">    "Content-Type"  = "application/json"</w:t>
-            </w:r>
-          </w:p>
-          <w:p>
-            <w:pPr>
-              <w:spacing w:before="0" w:after="0"/>
-            </w:pPr>
-            <w:r>
-              <w:rPr>
-                <w:rFonts w:ascii="Courier New" w:hAnsi="Courier New"/>
-                <w:color w:val="111827"/>
-                <w:sz w:val="17"/>
-              </w:rPr>
-              <w:t>}</w:t>
-            </w:r>
-          </w:p>
-          <w:p>
-            <w:pPr>
-              <w:spacing w:before="0" w:after="0"/>
-            </w:pPr>
-            <w:r>
-              <w:rPr>
-                <w:rFonts w:ascii="Courier New" w:hAnsi="Courier New"/>
-                <w:color w:val="111827"/>
-                <w:sz w:val="17"/>
-              </w:rPr>
-              <w:t xml:space="preserve"> </w:t>
-            </w:r>
-          </w:p>
-          <w:p>
-            <w:pPr>
-              <w:spacing w:before="0" w:after="0"/>
-            </w:pPr>
-            <w:r>
-              <w:rPr>
-                <w:rFonts w:ascii="Courier New" w:hAnsi="Courier New"/>
-                <w:color w:val="111827"/>
-                <w:sz w:val="17"/>
-              </w:rPr>
-              <w:t># 1. Create draft release</w:t>
-            </w:r>
-          </w:p>
-          <w:p>
-            <w:pPr>
-              <w:spacing w:before="0" w:after="0"/>
-            </w:pPr>
-            <w:r>
-              <w:rPr>
-                <w:rFonts w:ascii="Courier New" w:hAnsi="Courier New"/>
-                <w:color w:val="111827"/>
-                <w:sz w:val="17"/>
-              </w:rPr>
-              <w:t>$body = @{</w:t>
-            </w:r>
-          </w:p>
-          <w:p>
-            <w:pPr>
-              <w:spacing w:before="0" w:after="0"/>
-            </w:pPr>
-            <w:r>
-              <w:rPr>
-                <w:rFonts w:ascii="Courier New" w:hAnsi="Courier New"/>
-                <w:color w:val="111827"/>
-                <w:sz w:val="17"/>
-              </w:rPr>
-              <w:t xml:space="preserve">    tag_name = "v$version"</w:t>
-            </w:r>
-          </w:p>
-          <w:p>
-            <w:pPr>
-              <w:spacing w:before="0" w:after="0"/>
-            </w:pPr>
-            <w:r>
-              <w:rPr>
-                <w:rFonts w:ascii="Courier New" w:hAnsi="Courier New"/>
-                <w:color w:val="111827"/>
-                <w:sz w:val="17"/>
-              </w:rPr>
-              <w:t xml:space="preserve">    name     = "Securiti Desktop Server v$version"</w:t>
-            </w:r>
-          </w:p>
-          <w:p>
-            <w:pPr>
-              <w:spacing w:before="0" w:after="0"/>
-            </w:pPr>
-            <w:r>
-              <w:rPr>
-                <w:rFonts w:ascii="Courier New" w:hAnsi="Courier New"/>
-                <w:color w:val="111827"/>
-                <w:sz w:val="17"/>
-              </w:rPr>
-              <w:t xml:space="preserve">    draft    = $true</w:t>
-            </w:r>
-          </w:p>
-          <w:p>
-            <w:pPr>
-              <w:spacing w:before="0" w:after="0"/>
-            </w:pPr>
-            <w:r>
-              <w:rPr>
-                <w:rFonts w:ascii="Courier New" w:hAnsi="Courier New"/>
-                <w:color w:val="111827"/>
-                <w:sz w:val="17"/>
-              </w:rPr>
-              <w:t xml:space="preserve">    body     = "## Securiti Desktop Server v$version`n`nSee release notes."</w:t>
-            </w:r>
-          </w:p>
-          <w:p>
-            <w:pPr>
-              <w:spacing w:before="0" w:after="0"/>
-            </w:pPr>
-            <w:r>
-              <w:rPr>
-                <w:rFonts w:ascii="Courier New" w:hAnsi="Courier New"/>
-                <w:color w:val="111827"/>
-                <w:sz w:val="17"/>
-              </w:rPr>
-              <w:t>} | ConvertTo-Json</w:t>
-            </w:r>
-          </w:p>
-          <w:p>
-            <w:pPr>
-              <w:spacing w:before="0" w:after="0"/>
-            </w:pPr>
-            <w:r>
-              <w:rPr>
-                <w:rFonts w:ascii="Courier New" w:hAnsi="Courier New"/>
-                <w:color w:val="111827"/>
-                <w:sz w:val="17"/>
-              </w:rPr>
-              <w:t>$release = Invoke-RestMethod `</w:t>
-            </w:r>
-          </w:p>
-          <w:p>
-            <w:pPr>
-              <w:spacing w:before="0" w:after="0"/>
-            </w:pPr>
-            <w:r>
-              <w:rPr>
-                <w:rFonts w:ascii="Courier New" w:hAnsi="Courier New"/>
-                <w:color w:val="111827"/>
-                <w:sz w:val="17"/>
-              </w:rPr>
-              <w:t xml:space="preserve">    -Uri "https://api.github.com/repos/dominic96/securiti-releases/releases" `</w:t>
-            </w:r>
-          </w:p>
-          <w:p>
-            <w:pPr>
-              <w:spacing w:before="0" w:after="0"/>
-            </w:pPr>
-            <w:r>
-              <w:rPr>
-                <w:rFonts w:ascii="Courier New" w:hAnsi="Courier New"/>
-                <w:color w:val="111827"/>
-                <w:sz w:val="17"/>
-              </w:rPr>
-              <w:t xml:space="preserve">    -Method Post -Headers $headers -Body $body</w:t>
-            </w:r>
-          </w:p>
-          <w:p>
-            <w:pPr>
-              <w:spacing w:before="0" w:after="0"/>
-            </w:pPr>
-            <w:r>
-              <w:rPr>
-                <w:rFonts w:ascii="Courier New" w:hAnsi="Courier New"/>
-                <w:color w:val="111827"/>
-                <w:sz w:val="17"/>
-              </w:rPr>
-              <w:t xml:space="preserve"> </w:t>
-            </w:r>
-          </w:p>
-          <w:p>
-            <w:pPr>
-              <w:spacing w:before="0" w:after="0"/>
-            </w:pPr>
-            <w:r>
-              <w:rPr>
-                <w:rFonts w:ascii="Courier New" w:hAnsi="Courier New"/>
-                <w:color w:val="111827"/>
-                <w:sz w:val="17"/>
-              </w:rPr>
-              <w:t># 2. Upload installer (allow up to 30 minutes for large file)</w:t>
-            </w:r>
-          </w:p>
-          <w:p>
-            <w:pPr>
-              <w:spacing w:before="0" w:after="0"/>
-            </w:pPr>
-            <w:r>
-              <w:rPr>
-                <w:rFonts w:ascii="Courier New" w:hAnsi="Courier New"/>
-                <w:color w:val="111827"/>
-                <w:sz w:val="17"/>
-              </w:rPr>
-              <w:t>$uploadHeaders = @{</w:t>
-            </w:r>
-          </w:p>
-          <w:p>
-            <w:pPr>
-              <w:spacing w:before="0" w:after="0"/>
-            </w:pPr>
-            <w:r>
-              <w:rPr>
-                <w:rFonts w:ascii="Courier New" w:hAnsi="Courier New"/>
-                <w:color w:val="111827"/>
-                <w:sz w:val="17"/>
-              </w:rPr>
-              <w:t xml:space="preserve">    "Authorization" = "token $token"</w:t>
-            </w:r>
-          </w:p>
-          <w:p>
-            <w:pPr>
-              <w:spacing w:before="0" w:after="0"/>
-            </w:pPr>
-            <w:r>
-              <w:rPr>
-                <w:rFonts w:ascii="Courier New" w:hAnsi="Courier New"/>
-                <w:color w:val="111827"/>
-                <w:sz w:val="17"/>
-              </w:rPr>
-              <w:t xml:space="preserve">    "Content-Type"  = "application/octet-stream"</w:t>
-            </w:r>
-          </w:p>
-          <w:p>
-            <w:pPr>
-              <w:spacing w:before="0" w:after="0"/>
-            </w:pPr>
-            <w:r>
-              <w:rPr>
-                <w:rFonts w:ascii="Courier New" w:hAnsi="Courier New"/>
-                <w:color w:val="111827"/>
-                <w:sz w:val="17"/>
-              </w:rPr>
-              <w:t>}</w:t>
-            </w:r>
-          </w:p>
-          <w:p>
-            <w:pPr>
-              <w:spacing w:before="0" w:after="0"/>
-            </w:pPr>
-            <w:r>
-              <w:rPr>
-                <w:rFonts w:ascii="Courier New" w:hAnsi="Courier New"/>
-                <w:color w:val="111827"/>
-                <w:sz w:val="17"/>
-              </w:rPr>
-              <w:t>$uploadUrl = "https://uploads.github.com/repos/dominic96/securiti-releases/releases/$($release.id)/assets?name=Securiti_Desktop_Setup_$version.exe"</w:t>
-            </w:r>
-          </w:p>
-          <w:p>
-            <w:pPr>
-              <w:spacing w:before="0" w:after="0"/>
-            </w:pPr>
-            <w:r>
-              <w:rPr>
-                <w:rFonts w:ascii="Courier New" w:hAnsi="Courier New"/>
-                <w:color w:val="111827"/>
-                <w:sz w:val="17"/>
-              </w:rPr>
-              <w:t>Invoke-RestMethod `</w:t>
-            </w:r>
-          </w:p>
-          <w:p>
-            <w:pPr>
-              <w:spacing w:before="0" w:after="0"/>
-            </w:pPr>
-            <w:r>
-              <w:rPr>
-                <w:rFonts w:ascii="Courier New" w:hAnsi="Courier New"/>
-                <w:color w:val="111827"/>
-                <w:sz w:val="17"/>
-              </w:rPr>
-              <w:t xml:space="preserve">    -Uri $uploadUrl -Method Post `</w:t>
-            </w:r>
-          </w:p>
-          <w:p>
-            <w:pPr>
-              <w:spacing w:before="0" w:after="0"/>
-            </w:pPr>
-            <w:r>
-              <w:rPr>
-                <w:rFonts w:ascii="Courier New" w:hAnsi="Courier New"/>
-                <w:color w:val="111827"/>
-                <w:sz w:val="17"/>
-              </w:rPr>
-              <w:t xml:space="preserve">    -Headers $uploadHeaders `</w:t>
-            </w:r>
-          </w:p>
-          <w:p>
-            <w:pPr>
-              <w:spacing w:before="0" w:after="0"/>
-            </w:pPr>
-            <w:r>
-              <w:rPr>
-                <w:rFonts w:ascii="Courier New" w:hAnsi="Courier New"/>
-                <w:color w:val="111827"/>
-                <w:sz w:val="17"/>
-              </w:rPr>
-              <w:t xml:space="preserve">    -Body ([System.IO.File]::ReadAllBytes($file)) `</w:t>
-            </w:r>
-          </w:p>
-          <w:p>
-            <w:pPr>
-              <w:spacing w:before="0" w:after="0"/>
-            </w:pPr>
-            <w:r>
-              <w:rPr>
-                <w:rFonts w:ascii="Courier New" w:hAnsi="Courier New"/>
-                <w:color w:val="111827"/>
-                <w:sz w:val="17"/>
-              </w:rPr>
-              <w:t xml:space="preserve">    -TimeoutSec 1800</w:t>
-            </w:r>
-          </w:p>
-          <w:p>
-            <w:pPr>
-              <w:spacing w:before="0" w:after="0"/>
-            </w:pPr>
-            <w:r>
-              <w:rPr>
-                <w:rFonts w:ascii="Courier New" w:hAnsi="Courier New"/>
-                <w:color w:val="111827"/>
-                <w:sz w:val="17"/>
-              </w:rPr>
-              <w:t xml:space="preserve"> </w:t>
-            </w:r>
-          </w:p>
-          <w:p>
-            <w:pPr>
-              <w:spacing w:before="0" w:after="0"/>
-            </w:pPr>
-            <w:r>
-              <w:rPr>
-                <w:rFonts w:ascii="Courier New" w:hAnsi="Courier New"/>
-                <w:color w:val="111827"/>
-                <w:sz w:val="17"/>
-              </w:rPr>
-              <w:t># 3. Publish the release (take out of draft)</w:t>
-            </w:r>
-          </w:p>
-          <w:p>
-            <w:pPr>
-              <w:spacing w:before="0" w:after="0"/>
-            </w:pPr>
-            <w:r>
-              <w:rPr>
-                <w:rFonts w:ascii="Courier New" w:hAnsi="Courier New"/>
-                <w:color w:val="111827"/>
-                <w:sz w:val="17"/>
-              </w:rPr>
-              <w:t>$publishBody = @{ draft = $false } | ConvertTo-Json</w:t>
-            </w:r>
-          </w:p>
-          <w:p>
-            <w:pPr>
-              <w:spacing w:before="0" w:after="0"/>
-            </w:pPr>
-            <w:r>
-              <w:rPr>
-                <w:rFonts w:ascii="Courier New" w:hAnsi="Courier New"/>
-                <w:color w:val="111827"/>
-                <w:sz w:val="17"/>
-              </w:rPr>
-              <w:t>Invoke-RestMethod `</w:t>
-            </w:r>
-          </w:p>
-          <w:p>
-            <w:pPr>
-              <w:spacing w:before="0" w:after="0"/>
-            </w:pPr>
-            <w:r>
-              <w:rPr>
-                <w:rFonts w:ascii="Courier New" w:hAnsi="Courier New"/>
-                <w:color w:val="111827"/>
-                <w:sz w:val="17"/>
-              </w:rPr>
-              <w:t xml:space="preserve">    -Uri "https://api.github.com/repos/dominic96/securiti-releases/releases/$($release.id)" `</w:t>
-            </w:r>
-          </w:p>
-          <w:p>
-            <w:pPr>
-              <w:spacing w:before="0" w:after="0"/>
-            </w:pPr>
-            <w:r>
-              <w:rPr>
-                <w:rFonts w:ascii="Courier New" w:hAnsi="Courier New"/>
-                <w:color w:val="111827"/>
-                <w:sz w:val="17"/>
-              </w:rPr>
-              <w:t xml:space="preserve">    -Method Patch -Headers $headers -Body $publishBody</w:t>
-            </w:r>
-          </w:p>
-          <w:p>
-            <w:pPr>
-              <w:spacing w:before="0" w:after="0"/>
-            </w:pPr>
-            <w:r>
-              <w:rPr>
-                <w:rFonts w:ascii="Courier New" w:hAnsi="Courier New"/>
-                <w:color w:val="111827"/>
-                <w:sz w:val="17"/>
-              </w:rPr>
-              <w:t xml:space="preserve"> </w:t>
-            </w:r>
-          </w:p>
-          <w:p>
-            <w:pPr>
-              <w:spacing w:before="0" w:after="0"/>
-            </w:pPr>
-            <w:r>
-              <w:rPr>
-                <w:rFonts w:ascii="Courier New" w:hAnsi="Courier New"/>
-                <w:color w:val="111827"/>
-                <w:sz w:val="17"/>
-              </w:rPr>
-              <w:t>Write-Host "Done! https://github.com/dominic96/securiti-releases/releases/tag/v$version"</w:t>
+              <w:t>.\publish_release.ps1</w:t>
             </w:r>
           </w:p>
         </w:tc>
       </w:tr>
     </w:tbl>
     <w:p/>
+    <w:p>
+      <w:pPr>
+        <w:spacing w:before="0" w:after="80"/>
+      </w:pPr>
+      <w:r>
+        <w:rPr>
+          <w:rFonts w:ascii="Calibri" w:hAnsi="Calibri"/>
+          <w:color w:val="1F1F1F"/>
+          <w:sz w:val="20"/>
+        </w:rPr>
+        <w:t>The script runs three steps and prints progress:</w:t>
+      </w:r>
+    </w:p>
+    <w:tbl>
+      <w:tblPr>
+        <w:tblStyle w:val="TableGrid"/>
+        <w:tblW w:type="auto" w:w="0"/>
+        <w:tblLook w:firstColumn="1" w:firstRow="1" w:lastColumn="0" w:lastRow="0" w:noHBand="0" w:noVBand="1" w:val="04A0"/>
+      </w:tblPr>
+      <w:tblGrid>
+        <w:gridCol w:w="4703"/>
+        <w:gridCol w:w="4703"/>
+      </w:tblGrid>
+      <w:tr>
+        <w:tc>
+          <w:tcPr>
+            <w:tcW w:type="dxa" w:w="4703"/>
+            <w:shd w:val="clear" w:color="auto" w:fill="060061"/>
+            <w:tcBorders>
+              <w:top w:val="single" w:sz="4" w:space="0" w:color="060061"/>
+              <w:left w:val="single" w:sz="4" w:space="0" w:color="060061"/>
+              <w:bottom w:val="single" w:sz="4" w:space="0" w:color="060061"/>
+              <w:right w:val="single" w:sz="4" w:space="0" w:color="060061"/>
+            </w:tcBorders>
+          </w:tcPr>
+          <w:p>
+            <w:r>
+              <w:rPr>
+                <w:rFonts w:ascii="Calibri" w:hAnsi="Calibri"/>
+                <w:b/>
+                <w:color w:val="FFFFFF"/>
+                <w:sz w:val="19"/>
+              </w:rPr>
+              <w:t>Step</w:t>
+            </w:r>
+          </w:p>
+        </w:tc>
+        <w:tc>
+          <w:tcPr>
+            <w:tcW w:type="dxa" w:w="4703"/>
+            <w:shd w:val="clear" w:color="auto" w:fill="060061"/>
+            <w:tcBorders>
+              <w:top w:val="single" w:sz="4" w:space="0" w:color="060061"/>
+              <w:left w:val="single" w:sz="4" w:space="0" w:color="060061"/>
+              <w:bottom w:val="single" w:sz="4" w:space="0" w:color="060061"/>
+              <w:right w:val="single" w:sz="4" w:space="0" w:color="060061"/>
+            </w:tcBorders>
+          </w:tcPr>
+          <w:p>
+            <w:r>
+              <w:rPr>
+                <w:rFonts w:ascii="Calibri" w:hAnsi="Calibri"/>
+                <w:b/>
+                <w:color w:val="FFFFFF"/>
+                <w:sz w:val="19"/>
+              </w:rPr>
+              <w:t>What it does</w:t>
+            </w:r>
+          </w:p>
+        </w:tc>
+      </w:tr>
+      <w:tr>
+        <w:tc>
+          <w:tcPr>
+            <w:tcW w:type="dxa" w:w="4703"/>
+            <w:shd w:val="clear" w:color="auto" w:fill="E8E8F5"/>
+            <w:tcBorders>
+              <w:top w:val="single" w:sz="4" w:space="0" w:color="BFBFBF"/>
+              <w:left w:val="single" w:sz="4" w:space="0" w:color="BFBFBF"/>
+              <w:bottom w:val="single" w:sz="4" w:space="0" w:color="BFBFBF"/>
+              <w:right w:val="single" w:sz="4" w:space="0" w:color="BFBFBF"/>
+            </w:tcBorders>
+          </w:tcPr>
+          <w:p>
+            <w:r>
+              <w:rPr>
+                <w:rFonts w:ascii="Calibri" w:hAnsi="Calibri"/>
+                <w:b/>
+                <w:sz w:val="19"/>
+              </w:rPr>
+              <w:t>[1/3] Creating draft release</w:t>
+            </w:r>
+          </w:p>
+        </w:tc>
+        <w:tc>
+          <w:tcPr>
+            <w:tcW w:type="dxa" w:w="4703"/>
+            <w:shd w:val="clear" w:color="auto" w:fill="FFFFFF"/>
+            <w:tcBorders>
+              <w:top w:val="single" w:sz="4" w:space="0" w:color="BFBFBF"/>
+              <w:left w:val="single" w:sz="4" w:space="0" w:color="BFBFBF"/>
+              <w:bottom w:val="single" w:sz="4" w:space="0" w:color="BFBFBF"/>
+              <w:right w:val="single" w:sz="4" w:space="0" w:color="BFBFBF"/>
+            </w:tcBorders>
+          </w:tcPr>
+          <w:p>
+            <w:r>
+              <w:rPr>
+                <w:rFonts w:ascii="Calibri" w:hAnsi="Calibri"/>
+                <w:sz w:val="19"/>
+              </w:rPr>
+              <w:t>Creates the release on GitHub with the correct tag and release notes</w:t>
+            </w:r>
+          </w:p>
+        </w:tc>
+      </w:tr>
+      <w:tr>
+        <w:tc>
+          <w:tcPr>
+            <w:tcW w:type="dxa" w:w="4703"/>
+            <w:shd w:val="clear" w:color="auto" w:fill="E8E8F5"/>
+            <w:tcBorders>
+              <w:top w:val="single" w:sz="4" w:space="0" w:color="BFBFBF"/>
+              <w:left w:val="single" w:sz="4" w:space="0" w:color="BFBFBF"/>
+              <w:bottom w:val="single" w:sz="4" w:space="0" w:color="BFBFBF"/>
+              <w:right w:val="single" w:sz="4" w:space="0" w:color="BFBFBF"/>
+            </w:tcBorders>
+          </w:tcPr>
+          <w:p>
+            <w:r>
+              <w:rPr>
+                <w:rFonts w:ascii="Calibri" w:hAnsi="Calibri"/>
+                <w:b/>
+                <w:sz w:val="19"/>
+              </w:rPr>
+              <w:t>[2/3] Uploading installer</w:t>
+            </w:r>
+          </w:p>
+        </w:tc>
+        <w:tc>
+          <w:tcPr>
+            <w:tcW w:type="dxa" w:w="4703"/>
+            <w:shd w:val="clear" w:color="auto" w:fill="FFFFFF"/>
+            <w:tcBorders>
+              <w:top w:val="single" w:sz="4" w:space="0" w:color="BFBFBF"/>
+              <w:left w:val="single" w:sz="4" w:space="0" w:color="BFBFBF"/>
+              <w:bottom w:val="single" w:sz="4" w:space="0" w:color="BFBFBF"/>
+              <w:right w:val="single" w:sz="4" w:space="0" w:color="BFBFBF"/>
+            </w:tcBorders>
+          </w:tcPr>
+          <w:p>
+            <w:r>
+              <w:rPr>
+                <w:rFonts w:ascii="Calibri" w:hAnsi="Calibri"/>
+                <w:sz w:val="19"/>
+              </w:rPr>
+              <w:t>Uploads Securiti_Desktop_Setup_{version}.exe — allow 5–15 min for ~400 MB</w:t>
+            </w:r>
+          </w:p>
+        </w:tc>
+      </w:tr>
+      <w:tr>
+        <w:tc>
+          <w:tcPr>
+            <w:tcW w:type="dxa" w:w="4703"/>
+            <w:shd w:val="clear" w:color="auto" w:fill="E8E8F5"/>
+            <w:tcBorders>
+              <w:top w:val="single" w:sz="4" w:space="0" w:color="BFBFBF"/>
+              <w:left w:val="single" w:sz="4" w:space="0" w:color="BFBFBF"/>
+              <w:bottom w:val="single" w:sz="4" w:space="0" w:color="BFBFBF"/>
+              <w:right w:val="single" w:sz="4" w:space="0" w:color="BFBFBF"/>
+            </w:tcBorders>
+          </w:tcPr>
+          <w:p>
+            <w:r>
+              <w:rPr>
+                <w:rFonts w:ascii="Calibri" w:hAnsi="Calibri"/>
+                <w:b/>
+                <w:sz w:val="19"/>
+              </w:rPr>
+              <w:t>[3/3] Publishing release</w:t>
+            </w:r>
+          </w:p>
+        </w:tc>
+        <w:tc>
+          <w:tcPr>
+            <w:tcW w:type="dxa" w:w="4703"/>
+            <w:shd w:val="clear" w:color="auto" w:fill="FFFFFF"/>
+            <w:tcBorders>
+              <w:top w:val="single" w:sz="4" w:space="0" w:color="BFBFBF"/>
+              <w:left w:val="single" w:sz="4" w:space="0" w:color="BFBFBF"/>
+              <w:bottom w:val="single" w:sz="4" w:space="0" w:color="BFBFBF"/>
+              <w:right w:val="single" w:sz="4" w:space="0" w:color="BFBFBF"/>
+            </w:tcBorders>
+          </w:tcPr>
+          <w:p>
+            <w:r>
+              <w:rPr>
+                <w:rFonts w:ascii="Calibri" w:hAnsi="Calibri"/>
+                <w:sz w:val="19"/>
+              </w:rPr>
+              <w:t>Takes the release out of draft so it is publicly visible</w:t>
+            </w:r>
+          </w:p>
+        </w:tc>
+      </w:tr>
+    </w:tbl>
+    <w:p/>
+    <w:p>
+      <w:pPr>
+        <w:spacing w:before="0" w:after="80"/>
+      </w:pPr>
+      <w:r>
+        <w:rPr>
+          <w:rFonts w:ascii="Calibri" w:hAnsi="Calibri"/>
+          <w:color w:val="1F1F1F"/>
+          <w:sz w:val="20"/>
+        </w:rPr>
+        <w:t>On success the script prints the release URL and download URL.</w:t>
+      </w:r>
+    </w:p>
     <w:tbl>
       <w:tblPr>
         <w:tblStyle w:val="TableGrid"/>
@@ -2070,7 +1912,7 @@
                 <w:rFonts w:ascii="Calibri" w:hAnsi="Calibri"/>
                 <w:sz w:val="19"/>
               </w:rPr>
-              <w:t>⚠  The upload can take 5–15 minutes for a ~400 MB file. Do not close PowerShell while it is running.</w:t>
+              <w:t>⚠  Do not close PowerShell during the upload. If the upload fails mid-way, delete the draft release on GitHub (releases page → Delete) then re-run the script.</w:t>
             </w:r>
           </w:p>
         </w:tc>
@@ -4452,7 +4294,7 @@
           <w:rFonts w:ascii="Calibri" w:hAnsi="Calibri"/>
           <w:sz w:val="20"/>
         </w:rPr>
-        <w:t>[Step 6]  GitHub release created with tag v{version}</w:t>
+        <w:t>[Step 6]  $Version updated in publish_release.ps1 to match MyAppVersion</w:t>
       </w:r>
     </w:p>
     <w:p>
@@ -4473,7 +4315,7 @@
           <w:rFonts w:ascii="Calibri" w:hAnsi="Calibri"/>
           <w:sz w:val="20"/>
         </w:rPr>
-        <w:t>[Step 6]  Installer .exe attached to the GitHub release as an asset</w:t>
+        <w:t>[Step 6]  publish_release.ps1 ran without errors — all 3 steps completed</w:t>
       </w:r>
     </w:p>
     <w:p>
@@ -4494,7 +4336,7 @@
           <w:rFonts w:ascii="Calibri" w:hAnsi="Calibri"/>
           <w:sz w:val="20"/>
         </w:rPr>
-        <w:t>[Step 6]  Release published (not left as draft)</w:t>
+        <w:t>[Step 6]  Release URL printed by script — confirm tag is v{version} and not a draft</w:t>
       </w:r>
     </w:p>
     <w:p>
@@ -5083,7 +4925,7 @@
                 <w:b/>
                 <w:sz w:val="19"/>
               </w:rPr>
-              <w:t>$version in upload script</w:t>
+              <w:t>$Version in publish_release.ps1</w:t>
             </w:r>
           </w:p>
         </w:tc>
@@ -5104,7 +4946,7 @@
                 <w:rFonts w:ascii="Calibri" w:hAnsi="Calibri"/>
                 <w:sz w:val="19"/>
               </w:rPr>
-              <w:t>✏️  Manual — you change this to match (one line)</w:t>
+              <w:t>✏️  Manual — one line at the top of the script</w:t>
             </w:r>
           </w:p>
         </w:tc>
@@ -5128,7 +4970,7 @@
                 <w:b/>
                 <w:sz w:val="19"/>
               </w:rPr>
-              <w:t>GitHub release notes / body</w:t>
+              <w:t>$ReleaseNotes in publish_release.ps1</w:t>
             </w:r>
           </w:p>
         </w:tc>
@@ -5149,7 +4991,7 @@
                 <w:rFonts w:ascii="Calibri" w:hAnsi="Calibri"/>
                 <w:sz w:val="19"/>
               </w:rPr>
-              <w:t>✏️  Manual — edit the $body in the upload script</w:t>
+              <w:t>✏️  Manual — describe what changed in this version</w:t>
             </w:r>
           </w:p>
         </w:tc>

</xml_diff>

<commit_message>
docs: full absolute paths for script + key paths table in release guide
</commit_message>
<xml_diff>
--- a/Securiti_Desktop_Release_Guide.docx
+++ b/Securiti_Desktop_Release_Guide.docx
@@ -1505,7 +1505,7 @@
           <w:color w:val="1F1F1F"/>
           <w:sz w:val="20"/>
         </w:rPr>
-        <w:t>Script location:</w:t>
+        <w:t>Script file (open this in any text editor to edit it):</w:t>
       </w:r>
     </w:p>
     <w:tbl>
@@ -1539,7 +1539,7 @@
                 <w:color w:val="111827"/>
                 <w:sz w:val="17"/>
               </w:rPr>
-              <w:t>python/securiti-desktop/installer_build/publish_release.ps1</w:t>
+              <w:t>C:\Users\domin\Workspace\python\securiti-desktop\installer_build\publish_release.ps1</w:t>
             </w:r>
           </w:p>
         </w:tc>
@@ -1607,7 +1607,7 @@
           <w:color w:val="1F1F1F"/>
           <w:sz w:val="20"/>
         </w:rPr>
-        <w:t>Optionally update $ReleaseNotes in the same file to describe what changed. Then run the script from PowerShell:</w:t>
+        <w:t>Optionally update $ReleaseNotes in the same file to describe what changed in this version. Then run the script from PowerShell:</w:t>
       </w:r>
     </w:p>
     <w:tbl>
@@ -5373,7 +5373,52 @@
                 <w:rFonts w:ascii="Calibri" w:hAnsi="Calibri"/>
                 <w:sz w:val="19"/>
               </w:rPr>
-              <w:t>python/securiti-desktop/installer_build/SecuritiInstallerV1.iss  →  #define MyAppVersion</w:t>
+              <w:t>C:\Users\domin\Workspace\python\securiti-desktop\installer_build\SecuritiInstallerV1.iss  →  #define MyAppVersion</w:t>
+            </w:r>
+          </w:p>
+        </w:tc>
+      </w:tr>
+      <w:tr>
+        <w:tc>
+          <w:tcPr>
+            <w:tcW w:type="dxa" w:w="4703"/>
+            <w:shd w:val="clear" w:color="auto" w:fill="E8E8F5"/>
+            <w:tcBorders>
+              <w:top w:val="single" w:sz="4" w:space="0" w:color="BFBFBF"/>
+              <w:left w:val="single" w:sz="4" w:space="0" w:color="BFBFBF"/>
+              <w:bottom w:val="single" w:sz="4" w:space="0" w:color="BFBFBF"/>
+              <w:right w:val="single" w:sz="4" w:space="0" w:color="BFBFBF"/>
+            </w:tcBorders>
+          </w:tcPr>
+          <w:p>
+            <w:r>
+              <w:rPr>
+                <w:rFonts w:ascii="Calibri" w:hAnsi="Calibri"/>
+                <w:b/>
+                <w:sz w:val="19"/>
+              </w:rPr>
+              <w:t>Release script</w:t>
+            </w:r>
+          </w:p>
+        </w:tc>
+        <w:tc>
+          <w:tcPr>
+            <w:tcW w:type="dxa" w:w="4703"/>
+            <w:shd w:val="clear" w:color="auto" w:fill="FFFFFF"/>
+            <w:tcBorders>
+              <w:top w:val="single" w:sz="4" w:space="0" w:color="BFBFBF"/>
+              <w:left w:val="single" w:sz="4" w:space="0" w:color="BFBFBF"/>
+              <w:bottom w:val="single" w:sz="4" w:space="0" w:color="BFBFBF"/>
+              <w:right w:val="single" w:sz="4" w:space="0" w:color="BFBFBF"/>
+            </w:tcBorders>
+          </w:tcPr>
+          <w:p>
+            <w:r>
+              <w:rPr>
+                <w:rFonts w:ascii="Calibri" w:hAnsi="Calibri"/>
+                <w:sz w:val="19"/>
+              </w:rPr>
+              <w:t>C:\Users\domin\Workspace\python\securiti-desktop\installer_build\publish_release.ps1  →  $Version</w:t>
             </w:r>
           </w:p>
         </w:tc>
@@ -5418,7 +5463,7 @@
                 <w:rFonts w:ascii="Calibri" w:hAnsi="Calibri"/>
                 <w:sz w:val="19"/>
               </w:rPr>
-              <w:t>python/securiti-desktop/dist/SecuritiFlaskServer/</w:t>
+              <w:t>C:\Users\domin\Workspace\python\securiti-desktop\dist\SecuritiFlaskServer\</w:t>
             </w:r>
           </w:p>
         </w:tc>
@@ -5463,7 +5508,7 @@
                 <w:rFonts w:ascii="Calibri" w:hAnsi="Calibri"/>
                 <w:sz w:val="19"/>
               </w:rPr>
-              <w:t>CPP/video_server/build/Release/</w:t>
+              <w:t>C:\Users\domin\Workspace\CPP\video_server\build\Release\</w:t>
             </w:r>
           </w:p>
         </w:tc>
@@ -5508,7 +5553,7 @@
                 <w:rFonts w:ascii="Calibri" w:hAnsi="Calibri"/>
                 <w:sz w:val="19"/>
               </w:rPr>
-              <w:t>python/securiti-desktop/installer_build/FilesToInstall/</w:t>
+              <w:t>C:\Users\domin\Workspace\python\securiti-desktop\installer_build\FilesToInstall\</w:t>
             </w:r>
           </w:p>
         </w:tc>
@@ -5553,7 +5598,7 @@
                 <w:rFonts w:ascii="Calibri" w:hAnsi="Calibri"/>
                 <w:sz w:val="19"/>
               </w:rPr>
-              <w:t>python/securiti-desktop/installer_build/Output/Securiti_Desktop_Setup_{version}.exe</w:t>
+              <w:t>C:\Users\domin\Workspace\python\securiti-desktop\installer_build\Output\Securiti_Desktop_Setup_{version}.exe</w:t>
             </w:r>
           </w:p>
         </w:tc>

</xml_diff>